<commit_message>
ppt also done iam tired
</commit_message>
<xml_diff>
--- a/Report/report_review_1.docx
+++ b/Report/report_review_1.docx
@@ -4,7 +4,7 @@
   <w:body>
     <w:p>
       <w:pPr>
-        <w:pStyle w:val="1136"/>
+        <w:pStyle w:val="917"/>
         <w:pBdr/>
         <w:spacing w:after="200" w:line="360" w:lineRule="auto"/>
         <w:ind/>
@@ -48,6 +48,15 @@
           <w:szCs w:val="28"/>
         </w:rPr>
       </w:r>
+      <w:r>
+        <w:rPr>
+          <w:b/>
+          <w:bCs/>
+          <w:iCs/>
+          <w:sz w:val="28"/>
+          <w:szCs w:val="28"/>
+        </w:rPr>
+      </w:r>
     </w:p>
     <w:p>
       <w:pPr>
@@ -83,6 +92,15 @@
           <w:szCs w:val="24"/>
         </w:rPr>
       </w:r>
+      <w:r>
+        <w:rPr>
+          <w:i/>
+          <w:iCs/>
+          <w:color w:val="000000"/>
+          <w:sz w:val="24"/>
+          <w:szCs w:val="24"/>
+        </w:rPr>
+      </w:r>
     </w:p>
     <w:p>
       <w:pPr>
@@ -98,6 +116,15 @@
           <w:szCs w:val="24"/>
         </w:rPr>
       </w:pPr>
+      <w:r>
+        <w:rPr>
+          <w:i/>
+          <w:iCs/>
+          <w:color w:val="000000"/>
+          <w:sz w:val="24"/>
+          <w:szCs w:val="24"/>
+        </w:rPr>
+      </w:r>
       <w:r>
         <w:rPr>
           <w:i/>
@@ -147,6 +174,13 @@
           <w:szCs w:val="24"/>
         </w:rPr>
       </w:r>
+      <w:r>
+        <w:rPr>
+          <w:color w:val="000000"/>
+          <w:sz w:val="24"/>
+          <w:szCs w:val="24"/>
+        </w:rPr>
+      </w:r>
     </w:p>
     <w:p>
       <w:pPr>
@@ -160,6 +194,13 @@
           <w:szCs w:val="24"/>
         </w:rPr>
       </w:pPr>
+      <w:r>
+        <w:rPr>
+          <w:color w:val="000000"/>
+          <w:sz w:val="24"/>
+          <w:szCs w:val="24"/>
+        </w:rPr>
+      </w:r>
       <w:r>
         <w:rPr>
           <w:color w:val="000000"/>
@@ -177,7 +218,7 @@
     </w:p>
     <w:p>
       <w:pPr>
-        <w:pStyle w:val="1136"/>
+        <w:pStyle w:val="917"/>
         <w:pBdr/>
         <w:spacing w:after="200" w:line="360" w:lineRule="auto"/>
         <w:ind/>
@@ -202,10 +243,16 @@
           <w:bCs/>
         </w:rPr>
       </w:r>
+      <w:r>
+        <w:rPr>
+          <w:b/>
+          <w:bCs/>
+        </w:rPr>
+      </w:r>
     </w:p>
     <w:p>
       <w:pPr>
-        <w:pStyle w:val="1136"/>
+        <w:pStyle w:val="917"/>
         <w:pBdr/>
         <w:spacing w:after="200" w:line="360" w:lineRule="auto"/>
         <w:ind/>
@@ -234,7 +281,7 @@
     </w:p>
     <w:p>
       <w:pPr>
-        <w:pStyle w:val="1136"/>
+        <w:pStyle w:val="917"/>
         <w:pBdr/>
         <w:spacing w:after="120" w:line="240" w:lineRule="exact"/>
         <w:ind/>
@@ -382,10 +429,17 @@
           <w:color w:val="ff0000"/>
         </w:rPr>
       </w:r>
+      <w:r>
+        <w:rPr>
+          <w:b/>
+          <w:bCs/>
+          <w:color w:val="ff0000"/>
+        </w:rPr>
+      </w:r>
     </w:p>
     <w:p>
       <w:pPr>
-        <w:pStyle w:val="1136"/>
+        <w:pStyle w:val="917"/>
         <w:pBdr/>
         <w:spacing w:after="120" w:line="240" w:lineRule="exact"/>
         <w:ind/>
@@ -396,6 +450,13 @@
           <w:color w:val="ff0000"/>
         </w:rPr>
       </w:pPr>
+      <w:r>
+        <w:rPr>
+          <w:b/>
+          <w:bCs/>
+          <w:color w:val="ff0000"/>
+        </w:rPr>
+      </w:r>
       <w:r>
         <w:rPr>
           <w:b/>
@@ -413,7 +474,7 @@
     </w:p>
     <w:p>
       <w:pPr>
-        <w:pStyle w:val="1136"/>
+        <w:pStyle w:val="917"/>
         <w:pBdr/>
         <w:spacing w:after="120" w:line="240" w:lineRule="exact"/>
         <w:ind/>
@@ -425,7 +486,7 @@
     </w:p>
     <w:p>
       <w:pPr>
-        <w:pStyle w:val="1136"/>
+        <w:pStyle w:val="917"/>
         <w:pBdr/>
         <w:spacing w:after="120" w:line="276" w:lineRule="auto"/>
         <w:ind/>
@@ -442,53 +503,7 @@
     </w:p>
     <w:p>
       <w:pPr>
-        <w:pStyle w:val="1136"/>
-        <w:pBdr/>
-        <w:spacing w:after="120" w:line="276" w:lineRule="auto"/>
-        <w:ind/>
-        <w:jc w:val="center"/>
-        <w:rPr/>
-      </w:pPr>
-      <w:r>
-        <w:rPr>
-          <w:rFonts w:eastAsia="Times New Roman"/>
-        </w:rPr>
-        <w:t xml:space="preserve">2310040008: </w:t>
-      </w:r>
-      <w:r>
-        <w:rPr>
-          <w:rFonts w:eastAsia="Times New Roman"/>
-        </w:rPr>
-        <w:t xml:space="preserve">Pranav.M</w:t>
-      </w:r>
-      <w:r/>
-    </w:p>
-    <w:p>
-      <w:pPr>
-        <w:pStyle w:val="1136"/>
-        <w:pBdr/>
-        <w:spacing w:after="120" w:line="276" w:lineRule="auto"/>
-        <w:ind/>
-        <w:jc w:val="center"/>
-        <w:rPr/>
-      </w:pPr>
-      <w:r>
-        <w:rPr>
-          <w:rFonts w:eastAsia="Times New Roman"/>
-        </w:rPr>
-        <w:t xml:space="preserve">2310040010: </w:t>
-      </w:r>
-      <w:r>
-        <w:rPr>
-          <w:rFonts w:eastAsia="Times New Roman"/>
-        </w:rPr>
-        <w:t xml:space="preserve">Rohan.M</w:t>
-      </w:r>
-      <w:r/>
-    </w:p>
-    <w:p>
-      <w:pPr>
-        <w:pStyle w:val="1136"/>
+        <w:pStyle w:val="917"/>
         <w:pBdr/>
         <w:spacing w:after="120" w:line="276" w:lineRule="auto"/>
         <w:ind/>
@@ -505,7 +520,7 @@
     </w:p>
     <w:p>
       <w:pPr>
-        <w:pStyle w:val="1136"/>
+        <w:pStyle w:val="917"/>
         <w:pBdr/>
         <w:spacing w:after="120" w:line="276" w:lineRule="auto"/>
         <w:ind/>
@@ -522,7 +537,7 @@
     </w:p>
     <w:p>
       <w:pPr>
-        <w:pStyle w:val="1136"/>
+        <w:pStyle w:val="917"/>
         <w:pBdr/>
         <w:spacing w:after="120" w:line="240" w:lineRule="exact"/>
         <w:ind/>
@@ -532,6 +547,12 @@
           <w:bCs/>
         </w:rPr>
       </w:pPr>
+      <w:r>
+        <w:rPr>
+          <w:b/>
+          <w:bCs/>
+        </w:rPr>
+      </w:r>
       <w:r>
         <w:rPr>
           <w:b/>
@@ -547,7 +568,7 @@
     </w:p>
     <w:p>
       <w:pPr>
-        <w:pStyle w:val="1136"/>
+        <w:pStyle w:val="917"/>
         <w:pBdr/>
         <w:spacing w:after="120" w:line="240" w:lineRule="exact"/>
         <w:ind/>
@@ -559,7 +580,7 @@
     </w:p>
     <w:p>
       <w:pPr>
-        <w:pStyle w:val="1136"/>
+        <w:pStyle w:val="917"/>
         <w:pBdr/>
         <w:spacing w:after="200" w:line="276" w:lineRule="auto"/>
         <w:ind/>
@@ -576,7 +597,7 @@
     </w:p>
     <w:p>
       <w:pPr>
-        <w:pStyle w:val="1136"/>
+        <w:pStyle w:val="917"/>
         <w:pBdr/>
         <w:spacing w:after="200" w:line="276" w:lineRule="auto"/>
         <w:ind/>
@@ -605,7 +626,7 @@
     </w:p>
     <w:p>
       <w:pPr>
-        <w:pStyle w:val="1136"/>
+        <w:pStyle w:val="917"/>
         <w:pBdr/>
         <w:spacing w:after="200" w:line="360" w:lineRule="auto"/>
         <w:ind/>
@@ -615,6 +636,12 @@
           <w:bCs/>
         </w:rPr>
       </w:pPr>
+      <w:r>
+        <w:rPr>
+          <w:b/>
+          <w:bCs/>
+        </w:rPr>
+      </w:r>
       <w:r>
         <w:rPr>
           <w:b/>
@@ -630,7 +657,7 @@
     </w:p>
     <w:p>
       <w:pPr>
-        <w:pStyle w:val="1136"/>
+        <w:pStyle w:val="917"/>
         <w:pBdr/>
         <w:spacing w:after="200" w:line="360" w:lineRule="auto"/>
         <w:ind/>
@@ -720,10 +747,16 @@
           <w:bCs/>
         </w:rPr>
       </w:r>
+      <w:r>
+        <w:rPr>
+          <w:b/>
+          <w:bCs/>
+        </w:rPr>
+      </w:r>
     </w:p>
     <w:p>
       <w:pPr>
-        <w:pStyle w:val="1136"/>
+        <w:pStyle w:val="917"/>
         <w:pBdr/>
         <w:spacing w:after="200" w:line="360" w:lineRule="auto"/>
         <w:ind/>
@@ -733,6 +766,12 @@
           <w:bCs/>
         </w:rPr>
       </w:pPr>
+      <w:r>
+        <w:rPr>
+          <w:b/>
+          <w:bCs/>
+        </w:rPr>
+      </w:r>
       <w:r>
         <w:rPr>
           <w:b/>
@@ -748,7 +787,7 @@
     </w:p>
     <w:p>
       <w:pPr>
-        <w:pStyle w:val="1136"/>
+        <w:pStyle w:val="917"/>
         <w:pBdr/>
         <w:spacing w:after="200" w:line="360" w:lineRule="auto"/>
         <w:ind/>
@@ -765,7 +804,7 @@
     </w:p>
     <w:p>
       <w:pPr>
-        <w:pStyle w:val="1136"/>
+        <w:pStyle w:val="917"/>
         <w:pBdr/>
         <w:spacing w:after="200" w:line="360" w:lineRule="auto"/>
         <w:ind/>
@@ -782,7 +821,7 @@
     </w:p>
     <w:p>
       <w:pPr>
-        <w:pStyle w:val="1136"/>
+        <w:pStyle w:val="917"/>
         <w:pBdr/>
         <w:spacing w:after="200" w:line="360" w:lineRule="auto"/>
         <w:ind/>
@@ -821,8 +860,6 @@
           <w:szCs w:val="24"/>
         </w:rPr>
       </w:r>
-      <w:r/>
-      <w:r/>
       <w:r>
         <w:rPr>
           <w:sz w:val="24"/>
@@ -913,7 +950,7 @@
 <w:hdr xmlns:wpc="http://schemas.microsoft.com/office/word/2010/wordprocessingCanvas" xmlns:mc="http://schemas.openxmlformats.org/markup-compatibility/2006" xmlns:o="urn:schemas-microsoft-com:office:office" xmlns:r="http://schemas.openxmlformats.org/officeDocument/2006/relationships" xmlns:m="http://schemas.openxmlformats.org/officeDocument/2006/math" xmlns:v="urn:schemas-microsoft-com:vml" xmlns:wp14="http://schemas.microsoft.com/office/word/2010/wordprocessingDrawing" xmlns:wp="http://schemas.openxmlformats.org/drawingml/2006/wordprocessingDrawing" xmlns:w10="urn:schemas-microsoft-com:office:word" xmlns:w="http://schemas.openxmlformats.org/wordprocessingml/2006/main" xmlns:w14="http://schemas.microsoft.com/office/word/2010/wordml" xmlns:w15="http://schemas.microsoft.com/office/word/2012/wordml" xmlns:wpg="http://schemas.microsoft.com/office/word/2010/wordprocessingGroup" xmlns:wpi="http://schemas.microsoft.com/office/word/2010/wordprocessingInk" xmlns:wne="http://schemas.microsoft.com/office/word/2006/wordml" xmlns:a="http://schemas.openxmlformats.org/drawingml/2006/main" xmlns:wps="http://schemas.microsoft.com/office/word/2010/wordprocessingShape" mc:Ignorable="w14 w15 wp14">
   <w:p>
     <w:pPr>
-      <w:pStyle w:val="1133"/>
+      <w:pStyle w:val="914"/>
       <w:pBdr/>
       <w:spacing w:line="14" w:lineRule="auto"/>
       <w:ind/>
@@ -921,6 +958,11 @@
         <w:sz w:val="2"/>
       </w:rPr>
     </w:pPr>
+    <w:r>
+      <w:rPr>
+        <w:sz w:val="2"/>
+      </w:rPr>
+    </w:r>
     <w:r>
       <w:rPr>
         <w:sz w:val="2"/>
@@ -2599,9 +2641,9 @@
     <w:lsdException w:name="Bibliography" w:uiPriority="37"/>
     <w:lsdException w:name="TOC Heading" w:uiPriority="39" w:qFormat="1"/>
   </w:latentStyles>
-  <w:style w:type="table" w:styleId="11">
+  <w:style w:type="table" w:styleId="726">
     <w:name w:val="Table Grid"/>
-    <w:basedOn w:val="1129"/>
+    <w:basedOn w:val="910"/>
     <w:uiPriority w:val="59"/>
     <w:pPr>
       <w:pBdr/>
@@ -2798,9 +2840,9 @@
       </w:tcPr>
     </w:tblStylePr>
   </w:style>
-  <w:style w:type="table" w:styleId="12">
+  <w:style w:type="table" w:styleId="727">
     <w:name w:val="Table Grid Light"/>
-    <w:basedOn w:val="1129"/>
+    <w:basedOn w:val="910"/>
     <w:uiPriority w:val="59"/>
     <w:pPr>
       <w:pBdr/>
@@ -2997,9 +3039,9 @@
       </w:tcPr>
     </w:tblStylePr>
   </w:style>
-  <w:style w:type="table" w:styleId="13">
+  <w:style w:type="table" w:styleId="728">
     <w:name w:val="Plain Table 1"/>
-    <w:basedOn w:val="1129"/>
+    <w:basedOn w:val="910"/>
     <w:uiPriority w:val="59"/>
     <w:pPr>
       <w:pBdr/>
@@ -3222,9 +3264,9 @@
       </w:tcPr>
     </w:tblStylePr>
   </w:style>
-  <w:style w:type="table" w:styleId="14">
+  <w:style w:type="table" w:styleId="729">
     <w:name w:val="Plain Table 2"/>
-    <w:basedOn w:val="1129"/>
+    <w:basedOn w:val="910"/>
     <w:uiPriority w:val="59"/>
     <w:pPr>
       <w:pBdr/>
@@ -3455,9 +3497,9 @@
       </w:tcPr>
     </w:tblStylePr>
   </w:style>
-  <w:style w:type="table" w:styleId="15">
+  <w:style w:type="table" w:styleId="730">
     <w:name w:val="Plain Table 3"/>
-    <w:basedOn w:val="1129"/>
+    <w:basedOn w:val="910"/>
     <w:uiPriority w:val="99"/>
     <w:pPr>
       <w:pBdr/>
@@ -3685,9 +3727,9 @@
       </w:tcPr>
     </w:tblStylePr>
   </w:style>
-  <w:style w:type="table" w:styleId="16">
+  <w:style w:type="table" w:styleId="731">
     <w:name w:val="Plain Table 4"/>
-    <w:basedOn w:val="1129"/>
+    <w:basedOn w:val="910"/>
     <w:uiPriority w:val="99"/>
     <w:pPr>
       <w:pBdr/>
@@ -3901,9 +3943,9 @@
       </w:tcPr>
     </w:tblStylePr>
   </w:style>
-  <w:style w:type="table" w:styleId="17">
+  <w:style w:type="table" w:styleId="732">
     <w:name w:val="Plain Table 5"/>
-    <w:basedOn w:val="1129"/>
+    <w:basedOn w:val="910"/>
     <w:uiPriority w:val="99"/>
     <w:pPr>
       <w:pBdr/>
@@ -4134,9 +4176,9 @@
       </w:tcPr>
     </w:tblStylePr>
   </w:style>
-  <w:style w:type="table" w:styleId="18">
+  <w:style w:type="table" w:styleId="733">
     <w:name w:val="Grid Table 1 Light"/>
-    <w:basedOn w:val="1129"/>
+    <w:basedOn w:val="910"/>
     <w:uiPriority w:val="99"/>
     <w:pPr>
       <w:pBdr/>
@@ -4357,9 +4399,9 @@
       </w:tcPr>
     </w:tblStylePr>
   </w:style>
-  <w:style w:type="table" w:styleId="19">
+  <w:style w:type="table" w:styleId="734">
     <w:name w:val="Grid Table 1 Light - Accent 1"/>
-    <w:basedOn w:val="1129"/>
+    <w:basedOn w:val="910"/>
     <w:uiPriority w:val="99"/>
     <w:pPr>
       <w:pBdr/>
@@ -4580,9 +4622,9 @@
       </w:tcPr>
     </w:tblStylePr>
   </w:style>
-  <w:style w:type="table" w:styleId="20">
+  <w:style w:type="table" w:styleId="735">
     <w:name w:val="Grid Table 1 Light - Accent 2"/>
-    <w:basedOn w:val="1129"/>
+    <w:basedOn w:val="910"/>
     <w:uiPriority w:val="99"/>
     <w:pPr>
       <w:pBdr/>
@@ -4803,9 +4845,9 @@
       </w:tcPr>
     </w:tblStylePr>
   </w:style>
-  <w:style w:type="table" w:styleId="21">
+  <w:style w:type="table" w:styleId="736">
     <w:name w:val="Grid Table 1 Light - Accent 3"/>
-    <w:basedOn w:val="1129"/>
+    <w:basedOn w:val="910"/>
     <w:uiPriority w:val="99"/>
     <w:pPr>
       <w:pBdr/>
@@ -5026,9 +5068,9 @@
       </w:tcPr>
     </w:tblStylePr>
   </w:style>
-  <w:style w:type="table" w:styleId="22">
+  <w:style w:type="table" w:styleId="737">
     <w:name w:val="Grid Table 1 Light - Accent 4"/>
-    <w:basedOn w:val="1129"/>
+    <w:basedOn w:val="910"/>
     <w:uiPriority w:val="99"/>
     <w:pPr>
       <w:pBdr/>
@@ -5249,9 +5291,9 @@
       </w:tcPr>
     </w:tblStylePr>
   </w:style>
-  <w:style w:type="table" w:styleId="23">
+  <w:style w:type="table" w:styleId="738">
     <w:name w:val="Grid Table 1 Light - Accent 5"/>
-    <w:basedOn w:val="1129"/>
+    <w:basedOn w:val="910"/>
     <w:uiPriority w:val="99"/>
     <w:pPr>
       <w:pBdr/>
@@ -5472,9 +5514,9 @@
       </w:tcPr>
     </w:tblStylePr>
   </w:style>
-  <w:style w:type="table" w:styleId="24">
+  <w:style w:type="table" w:styleId="739">
     <w:name w:val="Grid Table 1 Light - Accent 6"/>
-    <w:basedOn w:val="1129"/>
+    <w:basedOn w:val="910"/>
     <w:uiPriority w:val="99"/>
     <w:pPr>
       <w:pBdr/>
@@ -5695,9 +5737,9 @@
       </w:tcPr>
     </w:tblStylePr>
   </w:style>
-  <w:style w:type="table" w:styleId="25">
+  <w:style w:type="table" w:styleId="740">
     <w:name w:val="Grid Table 2"/>
-    <w:basedOn w:val="1129"/>
+    <w:basedOn w:val="910"/>
     <w:uiPriority w:val="99"/>
     <w:pPr>
       <w:pBdr/>
@@ -5927,9 +5969,9 @@
       </w:tcPr>
     </w:tblStylePr>
   </w:style>
-  <w:style w:type="table" w:styleId="26">
+  <w:style w:type="table" w:styleId="741">
     <w:name w:val="Grid Table 2 - Accent 1"/>
-    <w:basedOn w:val="1129"/>
+    <w:basedOn w:val="910"/>
     <w:uiPriority w:val="99"/>
     <w:pPr>
       <w:pBdr/>
@@ -6159,9 +6201,9 @@
       </w:tcPr>
     </w:tblStylePr>
   </w:style>
-  <w:style w:type="table" w:styleId="27">
+  <w:style w:type="table" w:styleId="742">
     <w:name w:val="Grid Table 2 - Accent 2"/>
-    <w:basedOn w:val="1129"/>
+    <w:basedOn w:val="910"/>
     <w:uiPriority w:val="99"/>
     <w:pPr>
       <w:pBdr/>
@@ -6391,9 +6433,9 @@
       </w:tcPr>
     </w:tblStylePr>
   </w:style>
-  <w:style w:type="table" w:styleId="28">
+  <w:style w:type="table" w:styleId="743">
     <w:name w:val="Grid Table 2 - Accent 3"/>
-    <w:basedOn w:val="1129"/>
+    <w:basedOn w:val="910"/>
     <w:uiPriority w:val="99"/>
     <w:pPr>
       <w:pBdr/>
@@ -6623,9 +6665,9 @@
       </w:tcPr>
     </w:tblStylePr>
   </w:style>
-  <w:style w:type="table" w:styleId="29">
+  <w:style w:type="table" w:styleId="744">
     <w:name w:val="Grid Table 2 - Accent 4"/>
-    <w:basedOn w:val="1129"/>
+    <w:basedOn w:val="910"/>
     <w:uiPriority w:val="99"/>
     <w:pPr>
       <w:pBdr/>
@@ -6855,9 +6897,9 @@
       </w:tcPr>
     </w:tblStylePr>
   </w:style>
-  <w:style w:type="table" w:styleId="30">
+  <w:style w:type="table" w:styleId="745">
     <w:name w:val="Grid Table 2 - Accent 5"/>
-    <w:basedOn w:val="1129"/>
+    <w:basedOn w:val="910"/>
     <w:uiPriority w:val="99"/>
     <w:pPr>
       <w:pBdr/>
@@ -7087,9 +7129,9 @@
       </w:tcPr>
     </w:tblStylePr>
   </w:style>
-  <w:style w:type="table" w:styleId="31">
+  <w:style w:type="table" w:styleId="746">
     <w:name w:val="Grid Table 2 - Accent 6"/>
-    <w:basedOn w:val="1129"/>
+    <w:basedOn w:val="910"/>
     <w:uiPriority w:val="99"/>
     <w:pPr>
       <w:pBdr/>
@@ -7319,9 +7361,9 @@
       </w:tcPr>
     </w:tblStylePr>
   </w:style>
-  <w:style w:type="table" w:styleId="32">
+  <w:style w:type="table" w:styleId="747">
     <w:name w:val="Grid Table 3"/>
-    <w:basedOn w:val="1129"/>
+    <w:basedOn w:val="910"/>
     <w:uiPriority w:val="99"/>
     <w:pPr>
       <w:pBdr/>
@@ -7420,29 +7462,6 @@
         <w:tblBorders/>
       </w:tblPr>
       <w:tcPr>
-        <w:shd w:color="ffffff"/>
-        <w:tcBorders>
-          <w:top w:val="none" w:color="000000" w:sz="4" w:space="0"/>
-          <w:left w:val="none" w:color="000000" w:sz="4" w:space="0"/>
-          <w:bottom w:val="none" w:color="000000" w:sz="4" w:space="0"/>
-          <w:right w:val="none" w:color="000000" w:sz="4" w:space="0"/>
-        </w:tcBorders>
-      </w:tcPr>
-    </w:tblStylePr>
-    <w:tblStylePr w:type="firstRow">
-      <w:rPr>
-        <w:b/>
-        <w:color w:val="404040"/>
-      </w:rPr>
-      <w:pPr>
-        <w:pBdr/>
-        <w:spacing/>
-        <w:ind/>
-      </w:pPr>
-      <w:tblPr>
-        <w:tblBorders/>
-      </w:tblPr>
-      <w:tcPr>
         <w:shd w:val="clear" w:color="ffffff"/>
         <w:tcBorders>
           <w:top w:val="none" w:color="000000" w:sz="4" w:space="0"/>
@@ -7452,30 +7471,7 @@
         </w:tcBorders>
       </w:tcPr>
     </w:tblStylePr>
-    <w:tblStylePr w:type="lastCol">
-      <w:rPr>
-        <w:i/>
-        <w:color w:val="404040"/>
-      </w:rPr>
-      <w:pPr>
-        <w:pBdr/>
-        <w:spacing/>
-        <w:ind/>
-      </w:pPr>
-      <w:tblPr>
-        <w:tblBorders/>
-      </w:tblPr>
-      <w:tcPr>
-        <w:shd w:color="ffffff"/>
-        <w:tcBorders>
-          <w:top w:val="none" w:color="000000" w:sz="4" w:space="0"/>
-          <w:left w:val="none" w:color="000000" w:sz="4" w:space="0"/>
-          <w:bottom w:val="none" w:color="000000" w:sz="4" w:space="0"/>
-          <w:right w:val="none" w:color="000000" w:sz="4" w:space="0"/>
-        </w:tcBorders>
-      </w:tcPr>
-    </w:tblStylePr>
-    <w:tblStylePr w:type="lastRow">
+    <w:tblStylePr w:type="firstRow">
       <w:rPr>
         <w:b/>
         <w:color w:val="404040"/>
@@ -7498,6 +7494,52 @@
         </w:tcBorders>
       </w:tcPr>
     </w:tblStylePr>
+    <w:tblStylePr w:type="lastCol">
+      <w:rPr>
+        <w:i/>
+        <w:color w:val="404040"/>
+      </w:rPr>
+      <w:pPr>
+        <w:pBdr/>
+        <w:spacing/>
+        <w:ind/>
+      </w:pPr>
+      <w:tblPr>
+        <w:tblBorders/>
+      </w:tblPr>
+      <w:tcPr>
+        <w:shd w:val="clear" w:color="ffffff"/>
+        <w:tcBorders>
+          <w:top w:val="none" w:color="000000" w:sz="4" w:space="0"/>
+          <w:left w:val="none" w:color="000000" w:sz="4" w:space="0"/>
+          <w:bottom w:val="none" w:color="000000" w:sz="4" w:space="0"/>
+          <w:right w:val="none" w:color="000000" w:sz="4" w:space="0"/>
+        </w:tcBorders>
+      </w:tcPr>
+    </w:tblStylePr>
+    <w:tblStylePr w:type="lastRow">
+      <w:rPr>
+        <w:b/>
+        <w:color w:val="404040"/>
+      </w:rPr>
+      <w:pPr>
+        <w:pBdr/>
+        <w:spacing/>
+        <w:ind/>
+      </w:pPr>
+      <w:tblPr>
+        <w:tblBorders/>
+      </w:tblPr>
+      <w:tcPr>
+        <w:shd w:val="clear" w:color="ffffff"/>
+        <w:tcBorders>
+          <w:top w:val="none" w:color="000000" w:sz="4" w:space="0"/>
+          <w:left w:val="none" w:color="000000" w:sz="4" w:space="0"/>
+          <w:bottom w:val="none" w:color="000000" w:sz="4" w:space="0"/>
+          <w:right w:val="none" w:color="000000" w:sz="4" w:space="0"/>
+        </w:tcBorders>
+      </w:tcPr>
+    </w:tblStylePr>
     <w:tblStylePr w:type="nwCell">
       <w:pPr>
         <w:pBdr/>
@@ -7564,9 +7606,9 @@
       </w:tcPr>
     </w:tblStylePr>
   </w:style>
-  <w:style w:type="table" w:styleId="33">
+  <w:style w:type="table" w:styleId="748">
     <w:name w:val="Grid Table 3 - Accent 1"/>
-    <w:basedOn w:val="1129"/>
+    <w:basedOn w:val="910"/>
     <w:uiPriority w:val="99"/>
     <w:pPr>
       <w:pBdr/>
@@ -7665,29 +7707,6 @@
         <w:tblBorders/>
       </w:tblPr>
       <w:tcPr>
-        <w:shd w:color="ffffff"/>
-        <w:tcBorders>
-          <w:top w:val="none" w:color="000000" w:sz="4" w:space="0"/>
-          <w:left w:val="none" w:color="000000" w:sz="4" w:space="0"/>
-          <w:bottom w:val="none" w:color="000000" w:sz="4" w:space="0"/>
-          <w:right w:val="none" w:color="000000" w:sz="4" w:space="0"/>
-        </w:tcBorders>
-      </w:tcPr>
-    </w:tblStylePr>
-    <w:tblStylePr w:type="firstRow">
-      <w:rPr>
-        <w:b/>
-        <w:color w:val="404040"/>
-      </w:rPr>
-      <w:pPr>
-        <w:pBdr/>
-        <w:spacing/>
-        <w:ind/>
-      </w:pPr>
-      <w:tblPr>
-        <w:tblBorders/>
-      </w:tblPr>
-      <w:tcPr>
         <w:shd w:val="clear" w:color="ffffff"/>
         <w:tcBorders>
           <w:top w:val="none" w:color="000000" w:sz="4" w:space="0"/>
@@ -7697,30 +7716,7 @@
         </w:tcBorders>
       </w:tcPr>
     </w:tblStylePr>
-    <w:tblStylePr w:type="lastCol">
-      <w:rPr>
-        <w:i/>
-        <w:color w:val="404040"/>
-      </w:rPr>
-      <w:pPr>
-        <w:pBdr/>
-        <w:spacing/>
-        <w:ind/>
-      </w:pPr>
-      <w:tblPr>
-        <w:tblBorders/>
-      </w:tblPr>
-      <w:tcPr>
-        <w:shd w:color="ffffff"/>
-        <w:tcBorders>
-          <w:top w:val="none" w:color="000000" w:sz="4" w:space="0"/>
-          <w:left w:val="none" w:color="000000" w:sz="4" w:space="0"/>
-          <w:bottom w:val="none" w:color="000000" w:sz="4" w:space="0"/>
-          <w:right w:val="none" w:color="000000" w:sz="4" w:space="0"/>
-        </w:tcBorders>
-      </w:tcPr>
-    </w:tblStylePr>
-    <w:tblStylePr w:type="lastRow">
+    <w:tblStylePr w:type="firstRow">
       <w:rPr>
         <w:b/>
         <w:color w:val="404040"/>
@@ -7743,6 +7739,52 @@
         </w:tcBorders>
       </w:tcPr>
     </w:tblStylePr>
+    <w:tblStylePr w:type="lastCol">
+      <w:rPr>
+        <w:i/>
+        <w:color w:val="404040"/>
+      </w:rPr>
+      <w:pPr>
+        <w:pBdr/>
+        <w:spacing/>
+        <w:ind/>
+      </w:pPr>
+      <w:tblPr>
+        <w:tblBorders/>
+      </w:tblPr>
+      <w:tcPr>
+        <w:shd w:val="clear" w:color="ffffff"/>
+        <w:tcBorders>
+          <w:top w:val="none" w:color="000000" w:sz="4" w:space="0"/>
+          <w:left w:val="none" w:color="000000" w:sz="4" w:space="0"/>
+          <w:bottom w:val="none" w:color="000000" w:sz="4" w:space="0"/>
+          <w:right w:val="none" w:color="000000" w:sz="4" w:space="0"/>
+        </w:tcBorders>
+      </w:tcPr>
+    </w:tblStylePr>
+    <w:tblStylePr w:type="lastRow">
+      <w:rPr>
+        <w:b/>
+        <w:color w:val="404040"/>
+      </w:rPr>
+      <w:pPr>
+        <w:pBdr/>
+        <w:spacing/>
+        <w:ind/>
+      </w:pPr>
+      <w:tblPr>
+        <w:tblBorders/>
+      </w:tblPr>
+      <w:tcPr>
+        <w:shd w:val="clear" w:color="ffffff"/>
+        <w:tcBorders>
+          <w:top w:val="none" w:color="000000" w:sz="4" w:space="0"/>
+          <w:left w:val="none" w:color="000000" w:sz="4" w:space="0"/>
+          <w:bottom w:val="none" w:color="000000" w:sz="4" w:space="0"/>
+          <w:right w:val="none" w:color="000000" w:sz="4" w:space="0"/>
+        </w:tcBorders>
+      </w:tcPr>
+    </w:tblStylePr>
     <w:tblStylePr w:type="nwCell">
       <w:pPr>
         <w:pBdr/>
@@ -7809,9 +7851,9 @@
       </w:tcPr>
     </w:tblStylePr>
   </w:style>
-  <w:style w:type="table" w:styleId="34">
+  <w:style w:type="table" w:styleId="749">
     <w:name w:val="Grid Table 3 - Accent 2"/>
-    <w:basedOn w:val="1129"/>
+    <w:basedOn w:val="910"/>
     <w:uiPriority w:val="99"/>
     <w:pPr>
       <w:pBdr/>
@@ -7910,29 +7952,6 @@
         <w:tblBorders/>
       </w:tblPr>
       <w:tcPr>
-        <w:shd w:color="ffffff"/>
-        <w:tcBorders>
-          <w:top w:val="none" w:color="000000" w:sz="4" w:space="0"/>
-          <w:left w:val="none" w:color="000000" w:sz="4" w:space="0"/>
-          <w:bottom w:val="none" w:color="000000" w:sz="4" w:space="0"/>
-          <w:right w:val="none" w:color="000000" w:sz="4" w:space="0"/>
-        </w:tcBorders>
-      </w:tcPr>
-    </w:tblStylePr>
-    <w:tblStylePr w:type="firstRow">
-      <w:rPr>
-        <w:b/>
-        <w:color w:val="404040"/>
-      </w:rPr>
-      <w:pPr>
-        <w:pBdr/>
-        <w:spacing/>
-        <w:ind/>
-      </w:pPr>
-      <w:tblPr>
-        <w:tblBorders/>
-      </w:tblPr>
-      <w:tcPr>
         <w:shd w:val="clear" w:color="ffffff"/>
         <w:tcBorders>
           <w:top w:val="none" w:color="000000" w:sz="4" w:space="0"/>
@@ -7942,30 +7961,7 @@
         </w:tcBorders>
       </w:tcPr>
     </w:tblStylePr>
-    <w:tblStylePr w:type="lastCol">
-      <w:rPr>
-        <w:i/>
-        <w:color w:val="404040"/>
-      </w:rPr>
-      <w:pPr>
-        <w:pBdr/>
-        <w:spacing/>
-        <w:ind/>
-      </w:pPr>
-      <w:tblPr>
-        <w:tblBorders/>
-      </w:tblPr>
-      <w:tcPr>
-        <w:shd w:color="ffffff"/>
-        <w:tcBorders>
-          <w:top w:val="none" w:color="000000" w:sz="4" w:space="0"/>
-          <w:left w:val="none" w:color="000000" w:sz="4" w:space="0"/>
-          <w:bottom w:val="none" w:color="000000" w:sz="4" w:space="0"/>
-          <w:right w:val="none" w:color="000000" w:sz="4" w:space="0"/>
-        </w:tcBorders>
-      </w:tcPr>
-    </w:tblStylePr>
-    <w:tblStylePr w:type="lastRow">
+    <w:tblStylePr w:type="firstRow">
       <w:rPr>
         <w:b/>
         <w:color w:val="404040"/>
@@ -7988,6 +7984,52 @@
         </w:tcBorders>
       </w:tcPr>
     </w:tblStylePr>
+    <w:tblStylePr w:type="lastCol">
+      <w:rPr>
+        <w:i/>
+        <w:color w:val="404040"/>
+      </w:rPr>
+      <w:pPr>
+        <w:pBdr/>
+        <w:spacing/>
+        <w:ind/>
+      </w:pPr>
+      <w:tblPr>
+        <w:tblBorders/>
+      </w:tblPr>
+      <w:tcPr>
+        <w:shd w:val="clear" w:color="ffffff"/>
+        <w:tcBorders>
+          <w:top w:val="none" w:color="000000" w:sz="4" w:space="0"/>
+          <w:left w:val="none" w:color="000000" w:sz="4" w:space="0"/>
+          <w:bottom w:val="none" w:color="000000" w:sz="4" w:space="0"/>
+          <w:right w:val="none" w:color="000000" w:sz="4" w:space="0"/>
+        </w:tcBorders>
+      </w:tcPr>
+    </w:tblStylePr>
+    <w:tblStylePr w:type="lastRow">
+      <w:rPr>
+        <w:b/>
+        <w:color w:val="404040"/>
+      </w:rPr>
+      <w:pPr>
+        <w:pBdr/>
+        <w:spacing/>
+        <w:ind/>
+      </w:pPr>
+      <w:tblPr>
+        <w:tblBorders/>
+      </w:tblPr>
+      <w:tcPr>
+        <w:shd w:val="clear" w:color="ffffff"/>
+        <w:tcBorders>
+          <w:top w:val="none" w:color="000000" w:sz="4" w:space="0"/>
+          <w:left w:val="none" w:color="000000" w:sz="4" w:space="0"/>
+          <w:bottom w:val="none" w:color="000000" w:sz="4" w:space="0"/>
+          <w:right w:val="none" w:color="000000" w:sz="4" w:space="0"/>
+        </w:tcBorders>
+      </w:tcPr>
+    </w:tblStylePr>
     <w:tblStylePr w:type="nwCell">
       <w:pPr>
         <w:pBdr/>
@@ -8054,9 +8096,9 @@
       </w:tcPr>
     </w:tblStylePr>
   </w:style>
-  <w:style w:type="table" w:styleId="35">
+  <w:style w:type="table" w:styleId="750">
     <w:name w:val="Grid Table 3 - Accent 3"/>
-    <w:basedOn w:val="1129"/>
+    <w:basedOn w:val="910"/>
     <w:uiPriority w:val="99"/>
     <w:pPr>
       <w:pBdr/>
@@ -8155,29 +8197,6 @@
         <w:tblBorders/>
       </w:tblPr>
       <w:tcPr>
-        <w:shd w:color="ffffff"/>
-        <w:tcBorders>
-          <w:top w:val="none" w:color="000000" w:sz="4" w:space="0"/>
-          <w:left w:val="none" w:color="000000" w:sz="4" w:space="0"/>
-          <w:bottom w:val="none" w:color="000000" w:sz="4" w:space="0"/>
-          <w:right w:val="none" w:color="000000" w:sz="4" w:space="0"/>
-        </w:tcBorders>
-      </w:tcPr>
-    </w:tblStylePr>
-    <w:tblStylePr w:type="firstRow">
-      <w:rPr>
-        <w:b/>
-        <w:color w:val="404040"/>
-      </w:rPr>
-      <w:pPr>
-        <w:pBdr/>
-        <w:spacing/>
-        <w:ind/>
-      </w:pPr>
-      <w:tblPr>
-        <w:tblBorders/>
-      </w:tblPr>
-      <w:tcPr>
         <w:shd w:val="clear" w:color="ffffff"/>
         <w:tcBorders>
           <w:top w:val="none" w:color="000000" w:sz="4" w:space="0"/>
@@ -8187,30 +8206,7 @@
         </w:tcBorders>
       </w:tcPr>
     </w:tblStylePr>
-    <w:tblStylePr w:type="lastCol">
-      <w:rPr>
-        <w:i/>
-        <w:color w:val="404040"/>
-      </w:rPr>
-      <w:pPr>
-        <w:pBdr/>
-        <w:spacing/>
-        <w:ind/>
-      </w:pPr>
-      <w:tblPr>
-        <w:tblBorders/>
-      </w:tblPr>
-      <w:tcPr>
-        <w:shd w:color="ffffff"/>
-        <w:tcBorders>
-          <w:top w:val="none" w:color="000000" w:sz="4" w:space="0"/>
-          <w:left w:val="none" w:color="000000" w:sz="4" w:space="0"/>
-          <w:bottom w:val="none" w:color="000000" w:sz="4" w:space="0"/>
-          <w:right w:val="none" w:color="000000" w:sz="4" w:space="0"/>
-        </w:tcBorders>
-      </w:tcPr>
-    </w:tblStylePr>
-    <w:tblStylePr w:type="lastRow">
+    <w:tblStylePr w:type="firstRow">
       <w:rPr>
         <w:b/>
         <w:color w:val="404040"/>
@@ -8233,6 +8229,52 @@
         </w:tcBorders>
       </w:tcPr>
     </w:tblStylePr>
+    <w:tblStylePr w:type="lastCol">
+      <w:rPr>
+        <w:i/>
+        <w:color w:val="404040"/>
+      </w:rPr>
+      <w:pPr>
+        <w:pBdr/>
+        <w:spacing/>
+        <w:ind/>
+      </w:pPr>
+      <w:tblPr>
+        <w:tblBorders/>
+      </w:tblPr>
+      <w:tcPr>
+        <w:shd w:val="clear" w:color="ffffff"/>
+        <w:tcBorders>
+          <w:top w:val="none" w:color="000000" w:sz="4" w:space="0"/>
+          <w:left w:val="none" w:color="000000" w:sz="4" w:space="0"/>
+          <w:bottom w:val="none" w:color="000000" w:sz="4" w:space="0"/>
+          <w:right w:val="none" w:color="000000" w:sz="4" w:space="0"/>
+        </w:tcBorders>
+      </w:tcPr>
+    </w:tblStylePr>
+    <w:tblStylePr w:type="lastRow">
+      <w:rPr>
+        <w:b/>
+        <w:color w:val="404040"/>
+      </w:rPr>
+      <w:pPr>
+        <w:pBdr/>
+        <w:spacing/>
+        <w:ind/>
+      </w:pPr>
+      <w:tblPr>
+        <w:tblBorders/>
+      </w:tblPr>
+      <w:tcPr>
+        <w:shd w:val="clear" w:color="ffffff"/>
+        <w:tcBorders>
+          <w:top w:val="none" w:color="000000" w:sz="4" w:space="0"/>
+          <w:left w:val="none" w:color="000000" w:sz="4" w:space="0"/>
+          <w:bottom w:val="none" w:color="000000" w:sz="4" w:space="0"/>
+          <w:right w:val="none" w:color="000000" w:sz="4" w:space="0"/>
+        </w:tcBorders>
+      </w:tcPr>
+    </w:tblStylePr>
     <w:tblStylePr w:type="nwCell">
       <w:pPr>
         <w:pBdr/>
@@ -8299,9 +8341,9 @@
       </w:tcPr>
     </w:tblStylePr>
   </w:style>
-  <w:style w:type="table" w:styleId="36">
+  <w:style w:type="table" w:styleId="751">
     <w:name w:val="Grid Table 3 - Accent 4"/>
-    <w:basedOn w:val="1129"/>
+    <w:basedOn w:val="910"/>
     <w:uiPriority w:val="99"/>
     <w:pPr>
       <w:pBdr/>
@@ -8400,29 +8442,6 @@
         <w:tblBorders/>
       </w:tblPr>
       <w:tcPr>
-        <w:shd w:color="ffffff"/>
-        <w:tcBorders>
-          <w:top w:val="none" w:color="000000" w:sz="4" w:space="0"/>
-          <w:left w:val="none" w:color="000000" w:sz="4" w:space="0"/>
-          <w:bottom w:val="none" w:color="000000" w:sz="4" w:space="0"/>
-          <w:right w:val="none" w:color="000000" w:sz="4" w:space="0"/>
-        </w:tcBorders>
-      </w:tcPr>
-    </w:tblStylePr>
-    <w:tblStylePr w:type="firstRow">
-      <w:rPr>
-        <w:b/>
-        <w:color w:val="404040"/>
-      </w:rPr>
-      <w:pPr>
-        <w:pBdr/>
-        <w:spacing/>
-        <w:ind/>
-      </w:pPr>
-      <w:tblPr>
-        <w:tblBorders/>
-      </w:tblPr>
-      <w:tcPr>
         <w:shd w:val="clear" w:color="ffffff"/>
         <w:tcBorders>
           <w:top w:val="none" w:color="000000" w:sz="4" w:space="0"/>
@@ -8432,30 +8451,7 @@
         </w:tcBorders>
       </w:tcPr>
     </w:tblStylePr>
-    <w:tblStylePr w:type="lastCol">
-      <w:rPr>
-        <w:i/>
-        <w:color w:val="404040"/>
-      </w:rPr>
-      <w:pPr>
-        <w:pBdr/>
-        <w:spacing/>
-        <w:ind/>
-      </w:pPr>
-      <w:tblPr>
-        <w:tblBorders/>
-      </w:tblPr>
-      <w:tcPr>
-        <w:shd w:color="ffffff"/>
-        <w:tcBorders>
-          <w:top w:val="none" w:color="000000" w:sz="4" w:space="0"/>
-          <w:left w:val="none" w:color="000000" w:sz="4" w:space="0"/>
-          <w:bottom w:val="none" w:color="000000" w:sz="4" w:space="0"/>
-          <w:right w:val="none" w:color="000000" w:sz="4" w:space="0"/>
-        </w:tcBorders>
-      </w:tcPr>
-    </w:tblStylePr>
-    <w:tblStylePr w:type="lastRow">
+    <w:tblStylePr w:type="firstRow">
       <w:rPr>
         <w:b/>
         <w:color w:val="404040"/>
@@ -8478,6 +8474,52 @@
         </w:tcBorders>
       </w:tcPr>
     </w:tblStylePr>
+    <w:tblStylePr w:type="lastCol">
+      <w:rPr>
+        <w:i/>
+        <w:color w:val="404040"/>
+      </w:rPr>
+      <w:pPr>
+        <w:pBdr/>
+        <w:spacing/>
+        <w:ind/>
+      </w:pPr>
+      <w:tblPr>
+        <w:tblBorders/>
+      </w:tblPr>
+      <w:tcPr>
+        <w:shd w:val="clear" w:color="ffffff"/>
+        <w:tcBorders>
+          <w:top w:val="none" w:color="000000" w:sz="4" w:space="0"/>
+          <w:left w:val="none" w:color="000000" w:sz="4" w:space="0"/>
+          <w:bottom w:val="none" w:color="000000" w:sz="4" w:space="0"/>
+          <w:right w:val="none" w:color="000000" w:sz="4" w:space="0"/>
+        </w:tcBorders>
+      </w:tcPr>
+    </w:tblStylePr>
+    <w:tblStylePr w:type="lastRow">
+      <w:rPr>
+        <w:b/>
+        <w:color w:val="404040"/>
+      </w:rPr>
+      <w:pPr>
+        <w:pBdr/>
+        <w:spacing/>
+        <w:ind/>
+      </w:pPr>
+      <w:tblPr>
+        <w:tblBorders/>
+      </w:tblPr>
+      <w:tcPr>
+        <w:shd w:val="clear" w:color="ffffff"/>
+        <w:tcBorders>
+          <w:top w:val="none" w:color="000000" w:sz="4" w:space="0"/>
+          <w:left w:val="none" w:color="000000" w:sz="4" w:space="0"/>
+          <w:bottom w:val="none" w:color="000000" w:sz="4" w:space="0"/>
+          <w:right w:val="none" w:color="000000" w:sz="4" w:space="0"/>
+        </w:tcBorders>
+      </w:tcPr>
+    </w:tblStylePr>
     <w:tblStylePr w:type="nwCell">
       <w:pPr>
         <w:pBdr/>
@@ -8544,9 +8586,9 @@
       </w:tcPr>
     </w:tblStylePr>
   </w:style>
-  <w:style w:type="table" w:styleId="37">
+  <w:style w:type="table" w:styleId="752">
     <w:name w:val="Grid Table 3 - Accent 5"/>
-    <w:basedOn w:val="1129"/>
+    <w:basedOn w:val="910"/>
     <w:uiPriority w:val="99"/>
     <w:pPr>
       <w:pBdr/>
@@ -8645,29 +8687,6 @@
         <w:tblBorders/>
       </w:tblPr>
       <w:tcPr>
-        <w:shd w:color="ffffff"/>
-        <w:tcBorders>
-          <w:top w:val="none" w:color="000000" w:sz="4" w:space="0"/>
-          <w:left w:val="none" w:color="000000" w:sz="4" w:space="0"/>
-          <w:bottom w:val="none" w:color="000000" w:sz="4" w:space="0"/>
-          <w:right w:val="none" w:color="000000" w:sz="4" w:space="0"/>
-        </w:tcBorders>
-      </w:tcPr>
-    </w:tblStylePr>
-    <w:tblStylePr w:type="firstRow">
-      <w:rPr>
-        <w:b/>
-        <w:color w:val="404040"/>
-      </w:rPr>
-      <w:pPr>
-        <w:pBdr/>
-        <w:spacing/>
-        <w:ind/>
-      </w:pPr>
-      <w:tblPr>
-        <w:tblBorders/>
-      </w:tblPr>
-      <w:tcPr>
         <w:shd w:val="clear" w:color="ffffff"/>
         <w:tcBorders>
           <w:top w:val="none" w:color="000000" w:sz="4" w:space="0"/>
@@ -8677,30 +8696,7 @@
         </w:tcBorders>
       </w:tcPr>
     </w:tblStylePr>
-    <w:tblStylePr w:type="lastCol">
-      <w:rPr>
-        <w:i/>
-        <w:color w:val="404040"/>
-      </w:rPr>
-      <w:pPr>
-        <w:pBdr/>
-        <w:spacing/>
-        <w:ind/>
-      </w:pPr>
-      <w:tblPr>
-        <w:tblBorders/>
-      </w:tblPr>
-      <w:tcPr>
-        <w:shd w:color="ffffff"/>
-        <w:tcBorders>
-          <w:top w:val="none" w:color="000000" w:sz="4" w:space="0"/>
-          <w:left w:val="none" w:color="000000" w:sz="4" w:space="0"/>
-          <w:bottom w:val="none" w:color="000000" w:sz="4" w:space="0"/>
-          <w:right w:val="none" w:color="000000" w:sz="4" w:space="0"/>
-        </w:tcBorders>
-      </w:tcPr>
-    </w:tblStylePr>
-    <w:tblStylePr w:type="lastRow">
+    <w:tblStylePr w:type="firstRow">
       <w:rPr>
         <w:b/>
         <w:color w:val="404040"/>
@@ -8723,6 +8719,52 @@
         </w:tcBorders>
       </w:tcPr>
     </w:tblStylePr>
+    <w:tblStylePr w:type="lastCol">
+      <w:rPr>
+        <w:i/>
+        <w:color w:val="404040"/>
+      </w:rPr>
+      <w:pPr>
+        <w:pBdr/>
+        <w:spacing/>
+        <w:ind/>
+      </w:pPr>
+      <w:tblPr>
+        <w:tblBorders/>
+      </w:tblPr>
+      <w:tcPr>
+        <w:shd w:val="clear" w:color="ffffff"/>
+        <w:tcBorders>
+          <w:top w:val="none" w:color="000000" w:sz="4" w:space="0"/>
+          <w:left w:val="none" w:color="000000" w:sz="4" w:space="0"/>
+          <w:bottom w:val="none" w:color="000000" w:sz="4" w:space="0"/>
+          <w:right w:val="none" w:color="000000" w:sz="4" w:space="0"/>
+        </w:tcBorders>
+      </w:tcPr>
+    </w:tblStylePr>
+    <w:tblStylePr w:type="lastRow">
+      <w:rPr>
+        <w:b/>
+        <w:color w:val="404040"/>
+      </w:rPr>
+      <w:pPr>
+        <w:pBdr/>
+        <w:spacing/>
+        <w:ind/>
+      </w:pPr>
+      <w:tblPr>
+        <w:tblBorders/>
+      </w:tblPr>
+      <w:tcPr>
+        <w:shd w:val="clear" w:color="ffffff"/>
+        <w:tcBorders>
+          <w:top w:val="none" w:color="000000" w:sz="4" w:space="0"/>
+          <w:left w:val="none" w:color="000000" w:sz="4" w:space="0"/>
+          <w:bottom w:val="none" w:color="000000" w:sz="4" w:space="0"/>
+          <w:right w:val="none" w:color="000000" w:sz="4" w:space="0"/>
+        </w:tcBorders>
+      </w:tcPr>
+    </w:tblStylePr>
     <w:tblStylePr w:type="nwCell">
       <w:pPr>
         <w:pBdr/>
@@ -8789,9 +8831,9 @@
       </w:tcPr>
     </w:tblStylePr>
   </w:style>
-  <w:style w:type="table" w:styleId="38">
+  <w:style w:type="table" w:styleId="753">
     <w:name w:val="Grid Table 3 - Accent 6"/>
-    <w:basedOn w:val="1129"/>
+    <w:basedOn w:val="910"/>
     <w:uiPriority w:val="99"/>
     <w:pPr>
       <w:pBdr/>
@@ -8890,29 +8932,6 @@
         <w:tblBorders/>
       </w:tblPr>
       <w:tcPr>
-        <w:shd w:color="ffffff"/>
-        <w:tcBorders>
-          <w:top w:val="none" w:color="000000" w:sz="4" w:space="0"/>
-          <w:left w:val="none" w:color="000000" w:sz="4" w:space="0"/>
-          <w:bottom w:val="none" w:color="000000" w:sz="4" w:space="0"/>
-          <w:right w:val="none" w:color="000000" w:sz="4" w:space="0"/>
-        </w:tcBorders>
-      </w:tcPr>
-    </w:tblStylePr>
-    <w:tblStylePr w:type="firstRow">
-      <w:rPr>
-        <w:b/>
-        <w:color w:val="404040"/>
-      </w:rPr>
-      <w:pPr>
-        <w:pBdr/>
-        <w:spacing/>
-        <w:ind/>
-      </w:pPr>
-      <w:tblPr>
-        <w:tblBorders/>
-      </w:tblPr>
-      <w:tcPr>
         <w:shd w:val="clear" w:color="ffffff"/>
         <w:tcBorders>
           <w:top w:val="none" w:color="000000" w:sz="4" w:space="0"/>
@@ -8922,30 +8941,7 @@
         </w:tcBorders>
       </w:tcPr>
     </w:tblStylePr>
-    <w:tblStylePr w:type="lastCol">
-      <w:rPr>
-        <w:i/>
-        <w:color w:val="404040"/>
-      </w:rPr>
-      <w:pPr>
-        <w:pBdr/>
-        <w:spacing/>
-        <w:ind/>
-      </w:pPr>
-      <w:tblPr>
-        <w:tblBorders/>
-      </w:tblPr>
-      <w:tcPr>
-        <w:shd w:color="ffffff"/>
-        <w:tcBorders>
-          <w:top w:val="none" w:color="000000" w:sz="4" w:space="0"/>
-          <w:left w:val="none" w:color="000000" w:sz="4" w:space="0"/>
-          <w:bottom w:val="none" w:color="000000" w:sz="4" w:space="0"/>
-          <w:right w:val="none" w:color="000000" w:sz="4" w:space="0"/>
-        </w:tcBorders>
-      </w:tcPr>
-    </w:tblStylePr>
-    <w:tblStylePr w:type="lastRow">
+    <w:tblStylePr w:type="firstRow">
       <w:rPr>
         <w:b/>
         <w:color w:val="404040"/>
@@ -8968,6 +8964,52 @@
         </w:tcBorders>
       </w:tcPr>
     </w:tblStylePr>
+    <w:tblStylePr w:type="lastCol">
+      <w:rPr>
+        <w:i/>
+        <w:color w:val="404040"/>
+      </w:rPr>
+      <w:pPr>
+        <w:pBdr/>
+        <w:spacing/>
+        <w:ind/>
+      </w:pPr>
+      <w:tblPr>
+        <w:tblBorders/>
+      </w:tblPr>
+      <w:tcPr>
+        <w:shd w:val="clear" w:color="ffffff"/>
+        <w:tcBorders>
+          <w:top w:val="none" w:color="000000" w:sz="4" w:space="0"/>
+          <w:left w:val="none" w:color="000000" w:sz="4" w:space="0"/>
+          <w:bottom w:val="none" w:color="000000" w:sz="4" w:space="0"/>
+          <w:right w:val="none" w:color="000000" w:sz="4" w:space="0"/>
+        </w:tcBorders>
+      </w:tcPr>
+    </w:tblStylePr>
+    <w:tblStylePr w:type="lastRow">
+      <w:rPr>
+        <w:b/>
+        <w:color w:val="404040"/>
+      </w:rPr>
+      <w:pPr>
+        <w:pBdr/>
+        <w:spacing/>
+        <w:ind/>
+      </w:pPr>
+      <w:tblPr>
+        <w:tblBorders/>
+      </w:tblPr>
+      <w:tcPr>
+        <w:shd w:val="clear" w:color="ffffff"/>
+        <w:tcBorders>
+          <w:top w:val="none" w:color="000000" w:sz="4" w:space="0"/>
+          <w:left w:val="none" w:color="000000" w:sz="4" w:space="0"/>
+          <w:bottom w:val="none" w:color="000000" w:sz="4" w:space="0"/>
+          <w:right w:val="none" w:color="000000" w:sz="4" w:space="0"/>
+        </w:tcBorders>
+      </w:tcPr>
+    </w:tblStylePr>
     <w:tblStylePr w:type="nwCell">
       <w:pPr>
         <w:pBdr/>
@@ -9034,9 +9076,9 @@
       </w:tcPr>
     </w:tblStylePr>
   </w:style>
-  <w:style w:type="table" w:styleId="39">
+  <w:style w:type="table" w:styleId="754">
     <w:name w:val="Grid Table 4"/>
-    <w:basedOn w:val="1129"/>
+    <w:basedOn w:val="910"/>
     <w:uiPriority w:val="59"/>
     <w:pPr>
       <w:pBdr/>
@@ -9267,9 +9309,9 @@
       </w:tcPr>
     </w:tblStylePr>
   </w:style>
-  <w:style w:type="table" w:styleId="40">
+  <w:style w:type="table" w:styleId="755">
     <w:name w:val="Grid Table 4 - Accent 1"/>
-    <w:basedOn w:val="1129"/>
+    <w:basedOn w:val="910"/>
     <w:uiPriority w:val="59"/>
     <w:pPr>
       <w:pBdr/>
@@ -9500,9 +9542,9 @@
       </w:tcPr>
     </w:tblStylePr>
   </w:style>
-  <w:style w:type="table" w:styleId="41">
+  <w:style w:type="table" w:styleId="756">
     <w:name w:val="Grid Table 4 - Accent 2"/>
-    <w:basedOn w:val="1129"/>
+    <w:basedOn w:val="910"/>
     <w:uiPriority w:val="59"/>
     <w:pPr>
       <w:pBdr/>
@@ -9733,9 +9775,9 @@
       </w:tcPr>
     </w:tblStylePr>
   </w:style>
-  <w:style w:type="table" w:styleId="42">
+  <w:style w:type="table" w:styleId="757">
     <w:name w:val="Grid Table 4 - Accent 3"/>
-    <w:basedOn w:val="1129"/>
+    <w:basedOn w:val="910"/>
     <w:uiPriority w:val="59"/>
     <w:pPr>
       <w:pBdr/>
@@ -9966,9 +10008,9 @@
       </w:tcPr>
     </w:tblStylePr>
   </w:style>
-  <w:style w:type="table" w:styleId="43">
+  <w:style w:type="table" w:styleId="758">
     <w:name w:val="Grid Table 4 - Accent 4"/>
-    <w:basedOn w:val="1129"/>
+    <w:basedOn w:val="910"/>
     <w:uiPriority w:val="59"/>
     <w:pPr>
       <w:pBdr/>
@@ -10199,9 +10241,9 @@
       </w:tcPr>
     </w:tblStylePr>
   </w:style>
-  <w:style w:type="table" w:styleId="44">
+  <w:style w:type="table" w:styleId="759">
     <w:name w:val="Grid Table 4 - Accent 5"/>
-    <w:basedOn w:val="1129"/>
+    <w:basedOn w:val="910"/>
     <w:uiPriority w:val="59"/>
     <w:pPr>
       <w:pBdr/>
@@ -10432,9 +10474,9 @@
       </w:tcPr>
     </w:tblStylePr>
   </w:style>
-  <w:style w:type="table" w:styleId="45">
+  <w:style w:type="table" w:styleId="760">
     <w:name w:val="Grid Table 4 - Accent 6"/>
-    <w:basedOn w:val="1129"/>
+    <w:basedOn w:val="910"/>
     <w:uiPriority w:val="59"/>
     <w:pPr>
       <w:pBdr/>
@@ -10665,9 +10707,9 @@
       </w:tcPr>
     </w:tblStylePr>
   </w:style>
-  <w:style w:type="table" w:styleId="46">
+  <w:style w:type="table" w:styleId="761">
     <w:name w:val="Grid Table 5 Dark"/>
-    <w:basedOn w:val="1129"/>
+    <w:basedOn w:val="910"/>
     <w:uiPriority w:val="99"/>
     <w:pPr>
       <w:pBdr/>
@@ -10893,9 +10935,9 @@
       </w:tcPr>
     </w:tblStylePr>
   </w:style>
-  <w:style w:type="table" w:styleId="47">
+  <w:style w:type="table" w:styleId="762">
     <w:name w:val="Grid Table 5 Dark- Accent 1"/>
-    <w:basedOn w:val="1129"/>
+    <w:basedOn w:val="910"/>
     <w:uiPriority w:val="99"/>
     <w:pPr>
       <w:pBdr/>
@@ -11121,9 +11163,9 @@
       </w:tcPr>
     </w:tblStylePr>
   </w:style>
-  <w:style w:type="table" w:styleId="48">
+  <w:style w:type="table" w:styleId="763">
     <w:name w:val="Grid Table 5 Dark - Accent 2"/>
-    <w:basedOn w:val="1129"/>
+    <w:basedOn w:val="910"/>
     <w:uiPriority w:val="99"/>
     <w:pPr>
       <w:pBdr/>
@@ -11349,9 +11391,9 @@
       </w:tcPr>
     </w:tblStylePr>
   </w:style>
-  <w:style w:type="table" w:styleId="49">
+  <w:style w:type="table" w:styleId="764">
     <w:name w:val="Grid Table 5 Dark - Accent 3"/>
-    <w:basedOn w:val="1129"/>
+    <w:basedOn w:val="910"/>
     <w:uiPriority w:val="99"/>
     <w:pPr>
       <w:pBdr/>
@@ -11577,9 +11619,9 @@
       </w:tcPr>
     </w:tblStylePr>
   </w:style>
-  <w:style w:type="table" w:styleId="50">
+  <w:style w:type="table" w:styleId="765">
     <w:name w:val="Grid Table 5 Dark- Accent 4"/>
-    <w:basedOn w:val="1129"/>
+    <w:basedOn w:val="910"/>
     <w:uiPriority w:val="99"/>
     <w:pPr>
       <w:pBdr/>
@@ -11805,9 +11847,9 @@
       </w:tcPr>
     </w:tblStylePr>
   </w:style>
-  <w:style w:type="table" w:styleId="51">
+  <w:style w:type="table" w:styleId="766">
     <w:name w:val="Grid Table 5 Dark - Accent 5"/>
-    <w:basedOn w:val="1129"/>
+    <w:basedOn w:val="910"/>
     <w:uiPriority w:val="99"/>
     <w:pPr>
       <w:pBdr/>
@@ -12033,9 +12075,9 @@
       </w:tcPr>
     </w:tblStylePr>
   </w:style>
-  <w:style w:type="table" w:styleId="52">
+  <w:style w:type="table" w:styleId="767">
     <w:name w:val="Grid Table 5 Dark - Accent 6"/>
-    <w:basedOn w:val="1129"/>
+    <w:basedOn w:val="910"/>
     <w:uiPriority w:val="99"/>
     <w:pPr>
       <w:pBdr/>
@@ -12261,9 +12303,9 @@
       </w:tcPr>
     </w:tblStylePr>
   </w:style>
-  <w:style w:type="table" w:styleId="53">
+  <w:style w:type="table" w:styleId="768">
     <w:name w:val="Grid Table 6 Colorful"/>
-    <w:basedOn w:val="1129"/>
+    <w:basedOn w:val="910"/>
     <w:uiPriority w:val="99"/>
     <w:pPr>
       <w:pBdr/>
@@ -12491,9 +12533,9 @@
       </w:tcPr>
     </w:tblStylePr>
   </w:style>
-  <w:style w:type="table" w:styleId="54">
+  <w:style w:type="table" w:styleId="769">
     <w:name w:val="Grid Table 6 Colorful - Accent 1"/>
-    <w:basedOn w:val="1129"/>
+    <w:basedOn w:val="910"/>
     <w:uiPriority w:val="99"/>
     <w:pPr>
       <w:pBdr/>
@@ -12721,9 +12763,9 @@
       </w:tcPr>
     </w:tblStylePr>
   </w:style>
-  <w:style w:type="table" w:styleId="55">
+  <w:style w:type="table" w:styleId="770">
     <w:name w:val="Grid Table 6 Colorful - Accent 2"/>
-    <w:basedOn w:val="1129"/>
+    <w:basedOn w:val="910"/>
     <w:uiPriority w:val="99"/>
     <w:pPr>
       <w:pBdr/>
@@ -12951,9 +12993,9 @@
       </w:tcPr>
     </w:tblStylePr>
   </w:style>
-  <w:style w:type="table" w:styleId="56">
+  <w:style w:type="table" w:styleId="771">
     <w:name w:val="Grid Table 6 Colorful - Accent 3"/>
-    <w:basedOn w:val="1129"/>
+    <w:basedOn w:val="910"/>
     <w:uiPriority w:val="99"/>
     <w:pPr>
       <w:pBdr/>
@@ -13181,9 +13223,9 @@
       </w:tcPr>
     </w:tblStylePr>
   </w:style>
-  <w:style w:type="table" w:styleId="57">
+  <w:style w:type="table" w:styleId="772">
     <w:name w:val="Grid Table 6 Colorful - Accent 4"/>
-    <w:basedOn w:val="1129"/>
+    <w:basedOn w:val="910"/>
     <w:uiPriority w:val="99"/>
     <w:pPr>
       <w:pBdr/>
@@ -13411,9 +13453,9 @@
       </w:tcPr>
     </w:tblStylePr>
   </w:style>
-  <w:style w:type="table" w:styleId="58">
+  <w:style w:type="table" w:styleId="773">
     <w:name w:val="Grid Table 6 Colorful - Accent 5"/>
-    <w:basedOn w:val="1129"/>
+    <w:basedOn w:val="910"/>
     <w:uiPriority w:val="99"/>
     <w:pPr>
       <w:pBdr/>
@@ -13641,9 +13683,9 @@
       </w:tcPr>
     </w:tblStylePr>
   </w:style>
-  <w:style w:type="table" w:styleId="59">
+  <w:style w:type="table" w:styleId="774">
     <w:name w:val="Grid Table 6 Colorful - Accent 6"/>
-    <w:basedOn w:val="1129"/>
+    <w:basedOn w:val="910"/>
     <w:uiPriority w:val="99"/>
     <w:pPr>
       <w:pBdr/>
@@ -13871,9 +13913,9 @@
       </w:tcPr>
     </w:tblStylePr>
   </w:style>
-  <w:style w:type="table" w:styleId="60">
+  <w:style w:type="table" w:styleId="775">
     <w:name w:val="Grid Table 7 Colorful"/>
-    <w:basedOn w:val="1129"/>
+    <w:basedOn w:val="910"/>
     <w:uiPriority w:val="99"/>
     <w:pPr>
       <w:pBdr/>
@@ -13975,11 +14017,11 @@
         <w:tblBorders/>
       </w:tblPr>
       <w:tcPr>
-        <w:shd w:color="ffffff"/>
+        <w:shd w:val="clear" w:color="ffffff"/>
         <w:tcBorders>
-          <w:top w:val="none"/>
-          <w:left w:val="none"/>
-          <w:bottom w:val="none"/>
+          <w:top w:val="none" w:color="000000" w:sz="4" w:space="0"/>
+          <w:left w:val="none" w:color="000000" w:sz="4" w:space="0"/>
+          <w:bottom w:val="none" w:color="000000" w:sz="4" w:space="0"/>
           <w:right w:val="single" w:color="000000" w:themeColor="text1" w:themeTint="80" w:sz="4" w:space="0"/>
         </w:tcBorders>
       </w:tcPr>
@@ -14002,10 +14044,10 @@
       <w:tcPr>
         <w:shd w:val="clear" w:color="ffffff" w:themeColor="light1" w:fill="ffffff" w:themeFill="light1"/>
         <w:tcBorders>
-          <w:top w:val="none"/>
-          <w:left w:val="none"/>
+          <w:top w:val="none" w:color="000000" w:sz="4" w:space="0"/>
+          <w:left w:val="none" w:color="000000" w:sz="4" w:space="0"/>
           <w:bottom w:val="single" w:color="000000" w:themeColor="text1" w:themeTint="80" w:sz="4" w:space="0"/>
-          <w:right w:val="none"/>
+          <w:right w:val="none" w:color="000000" w:sz="4" w:space="0"/>
         </w:tcBorders>
       </w:tcPr>
     </w:tblStylePr>
@@ -14025,12 +14067,12 @@
         <w:tblBorders/>
       </w:tblPr>
       <w:tcPr>
-        <w:shd w:color="ffffff"/>
+        <w:shd w:val="clear" w:color="ffffff"/>
         <w:tcBorders>
-          <w:top w:val="none"/>
+          <w:top w:val="none" w:color="000000" w:sz="4" w:space="0"/>
           <w:left w:val="single" w:color="000000" w:themeColor="text1" w:themeTint="80" w:sz="4" w:space="0"/>
-          <w:bottom w:val="none"/>
-          <w:right w:val="none"/>
+          <w:bottom w:val="none" w:color="000000" w:sz="4" w:space="0"/>
+          <w:right w:val="none" w:color="000000" w:sz="4" w:space="0"/>
         </w:tcBorders>
       </w:tcPr>
     </w:tblStylePr>
@@ -14053,9 +14095,9 @@
         <w:shd w:val="clear" w:color="ffffff" w:themeColor="light1" w:fill="ffffff" w:themeFill="light1"/>
         <w:tcBorders>
           <w:top w:val="single" w:color="000000" w:themeColor="text1" w:themeTint="80" w:sz="4" w:space="0"/>
-          <w:left w:val="none"/>
-          <w:bottom w:val="none"/>
-          <w:right w:val="none"/>
+          <w:left w:val="none" w:color="000000" w:sz="4" w:space="0"/>
+          <w:bottom w:val="none" w:color="000000" w:sz="4" w:space="0"/>
+          <w:right w:val="none" w:color="000000" w:sz="4" w:space="0"/>
         </w:tcBorders>
       </w:tcPr>
     </w:tblStylePr>
@@ -14125,9 +14167,9 @@
       </w:tcPr>
     </w:tblStylePr>
   </w:style>
-  <w:style w:type="table" w:styleId="61">
+  <w:style w:type="table" w:styleId="776">
     <w:name w:val="Grid Table 7 Colorful - Accent 1"/>
-    <w:basedOn w:val="1129"/>
+    <w:basedOn w:val="910"/>
     <w:uiPriority w:val="99"/>
     <w:pPr>
       <w:pBdr/>
@@ -14229,11 +14271,11 @@
         <w:tblBorders/>
       </w:tblPr>
       <w:tcPr>
-        <w:shd w:color="ffffff"/>
+        <w:shd w:val="clear" w:color="ffffff"/>
         <w:tcBorders>
-          <w:top w:val="none"/>
-          <w:left w:val="none"/>
-          <w:bottom w:val="none"/>
+          <w:top w:val="none" w:color="000000" w:sz="4" w:space="0"/>
+          <w:left w:val="none" w:color="000000" w:sz="4" w:space="0"/>
+          <w:bottom w:val="none" w:color="000000" w:sz="4" w:space="0"/>
           <w:right w:val="single" w:color="000000" w:themeColor="accent1" w:themeTint="80" w:sz="4" w:space="0"/>
         </w:tcBorders>
       </w:tcPr>
@@ -14256,10 +14298,10 @@
       <w:tcPr>
         <w:shd w:val="clear" w:color="ffffff" w:themeColor="light1" w:fill="ffffff" w:themeFill="light1"/>
         <w:tcBorders>
-          <w:top w:val="none"/>
-          <w:left w:val="none"/>
+          <w:top w:val="none" w:color="000000" w:sz="4" w:space="0"/>
+          <w:left w:val="none" w:color="000000" w:sz="4" w:space="0"/>
           <w:bottom w:val="single" w:color="000000" w:themeColor="accent1" w:themeTint="80" w:sz="4" w:space="0"/>
-          <w:right w:val="none"/>
+          <w:right w:val="none" w:color="000000" w:sz="4" w:space="0"/>
         </w:tcBorders>
       </w:tcPr>
     </w:tblStylePr>
@@ -14279,12 +14321,12 @@
         <w:tblBorders/>
       </w:tblPr>
       <w:tcPr>
-        <w:shd w:color="ffffff"/>
+        <w:shd w:val="clear" w:color="ffffff"/>
         <w:tcBorders>
-          <w:top w:val="none"/>
+          <w:top w:val="none" w:color="000000" w:sz="4" w:space="0"/>
           <w:left w:val="single" w:color="000000" w:themeColor="accent1" w:themeTint="80" w:sz="4" w:space="0"/>
-          <w:bottom w:val="none"/>
-          <w:right w:val="none"/>
+          <w:bottom w:val="none" w:color="000000" w:sz="4" w:space="0"/>
+          <w:right w:val="none" w:color="000000" w:sz="4" w:space="0"/>
         </w:tcBorders>
       </w:tcPr>
     </w:tblStylePr>
@@ -14307,9 +14349,9 @@
         <w:shd w:val="clear" w:color="ffffff" w:themeColor="light1" w:fill="ffffff" w:themeFill="light1"/>
         <w:tcBorders>
           <w:top w:val="single" w:color="000000" w:themeColor="accent1" w:themeTint="80" w:sz="4" w:space="0"/>
-          <w:left w:val="none"/>
-          <w:bottom w:val="none"/>
-          <w:right w:val="none"/>
+          <w:left w:val="none" w:color="000000" w:sz="4" w:space="0"/>
+          <w:bottom w:val="none" w:color="000000" w:sz="4" w:space="0"/>
+          <w:right w:val="none" w:color="000000" w:sz="4" w:space="0"/>
         </w:tcBorders>
       </w:tcPr>
     </w:tblStylePr>
@@ -14379,9 +14421,9 @@
       </w:tcPr>
     </w:tblStylePr>
   </w:style>
-  <w:style w:type="table" w:styleId="62">
+  <w:style w:type="table" w:styleId="777">
     <w:name w:val="Grid Table 7 Colorful - Accent 2"/>
-    <w:basedOn w:val="1129"/>
+    <w:basedOn w:val="910"/>
     <w:uiPriority w:val="99"/>
     <w:pPr>
       <w:pBdr/>
@@ -14483,11 +14525,11 @@
         <w:tblBorders/>
       </w:tblPr>
       <w:tcPr>
-        <w:shd w:color="ffffff"/>
+        <w:shd w:val="clear" w:color="ffffff"/>
         <w:tcBorders>
-          <w:top w:val="none"/>
-          <w:left w:val="none"/>
-          <w:bottom w:val="none"/>
+          <w:top w:val="none" w:color="000000" w:sz="4" w:space="0"/>
+          <w:left w:val="none" w:color="000000" w:sz="4" w:space="0"/>
+          <w:bottom w:val="none" w:color="000000" w:sz="4" w:space="0"/>
           <w:right w:val="single" w:color="000000" w:themeColor="accent2" w:themeTint="97" w:sz="4" w:space="0"/>
         </w:tcBorders>
       </w:tcPr>
@@ -14510,10 +14552,10 @@
       <w:tcPr>
         <w:shd w:val="clear" w:color="ffffff" w:themeColor="light1" w:fill="ffffff" w:themeFill="light1"/>
         <w:tcBorders>
-          <w:top w:val="none"/>
-          <w:left w:val="none"/>
+          <w:top w:val="none" w:color="000000" w:sz="4" w:space="0"/>
+          <w:left w:val="none" w:color="000000" w:sz="4" w:space="0"/>
           <w:bottom w:val="single" w:color="000000" w:themeColor="accent2" w:themeTint="97" w:sz="4" w:space="0"/>
-          <w:right w:val="none"/>
+          <w:right w:val="none" w:color="000000" w:sz="4" w:space="0"/>
         </w:tcBorders>
       </w:tcPr>
     </w:tblStylePr>
@@ -14533,12 +14575,12 @@
         <w:tblBorders/>
       </w:tblPr>
       <w:tcPr>
-        <w:shd w:color="ffffff"/>
+        <w:shd w:val="clear" w:color="ffffff"/>
         <w:tcBorders>
-          <w:top w:val="none"/>
+          <w:top w:val="none" w:color="000000" w:sz="4" w:space="0"/>
           <w:left w:val="single" w:color="000000" w:themeColor="accent2" w:themeTint="97" w:sz="4" w:space="0"/>
-          <w:bottom w:val="none"/>
-          <w:right w:val="none"/>
+          <w:bottom w:val="none" w:color="000000" w:sz="4" w:space="0"/>
+          <w:right w:val="none" w:color="000000" w:sz="4" w:space="0"/>
         </w:tcBorders>
       </w:tcPr>
     </w:tblStylePr>
@@ -14561,9 +14603,9 @@
         <w:shd w:val="clear" w:color="ffffff" w:themeColor="light1" w:fill="ffffff" w:themeFill="light1"/>
         <w:tcBorders>
           <w:top w:val="single" w:color="000000" w:themeColor="accent2" w:themeTint="97" w:sz="4" w:space="0"/>
-          <w:left w:val="none"/>
-          <w:bottom w:val="none"/>
-          <w:right w:val="none"/>
+          <w:left w:val="none" w:color="000000" w:sz="4" w:space="0"/>
+          <w:bottom w:val="none" w:color="000000" w:sz="4" w:space="0"/>
+          <w:right w:val="none" w:color="000000" w:sz="4" w:space="0"/>
         </w:tcBorders>
       </w:tcPr>
     </w:tblStylePr>
@@ -14633,9 +14675,9 @@
       </w:tcPr>
     </w:tblStylePr>
   </w:style>
-  <w:style w:type="table" w:styleId="63">
+  <w:style w:type="table" w:styleId="778">
     <w:name w:val="Grid Table 7 Colorful - Accent 3"/>
-    <w:basedOn w:val="1129"/>
+    <w:basedOn w:val="910"/>
     <w:uiPriority w:val="99"/>
     <w:pPr>
       <w:pBdr/>
@@ -14737,11 +14779,11 @@
         <w:tblBorders/>
       </w:tblPr>
       <w:tcPr>
-        <w:shd w:color="ffffff"/>
+        <w:shd w:val="clear" w:color="ffffff"/>
         <w:tcBorders>
-          <w:top w:val="none"/>
-          <w:left w:val="none"/>
-          <w:bottom w:val="none"/>
+          <w:top w:val="none" w:color="000000" w:sz="4" w:space="0"/>
+          <w:left w:val="none" w:color="000000" w:sz="4" w:space="0"/>
+          <w:bottom w:val="none" w:color="000000" w:sz="4" w:space="0"/>
           <w:right w:val="single" w:color="000000" w:themeColor="accent3" w:themeTint="FE" w:sz="4" w:space="0"/>
         </w:tcBorders>
       </w:tcPr>
@@ -14764,10 +14806,10 @@
       <w:tcPr>
         <w:shd w:val="clear" w:color="ffffff" w:themeColor="light1" w:fill="ffffff" w:themeFill="light1"/>
         <w:tcBorders>
-          <w:top w:val="none"/>
-          <w:left w:val="none"/>
+          <w:top w:val="none" w:color="000000" w:sz="4" w:space="0"/>
+          <w:left w:val="none" w:color="000000" w:sz="4" w:space="0"/>
           <w:bottom w:val="single" w:color="000000" w:themeColor="accent3" w:themeTint="FE" w:sz="4" w:space="0"/>
-          <w:right w:val="none"/>
+          <w:right w:val="none" w:color="000000" w:sz="4" w:space="0"/>
         </w:tcBorders>
       </w:tcPr>
     </w:tblStylePr>
@@ -14787,12 +14829,12 @@
         <w:tblBorders/>
       </w:tblPr>
       <w:tcPr>
-        <w:shd w:color="ffffff"/>
+        <w:shd w:val="clear" w:color="ffffff"/>
         <w:tcBorders>
-          <w:top w:val="none"/>
+          <w:top w:val="none" w:color="000000" w:sz="4" w:space="0"/>
           <w:left w:val="single" w:color="000000" w:themeColor="accent3" w:themeTint="FE" w:sz="4" w:space="0"/>
-          <w:bottom w:val="none"/>
-          <w:right w:val="none"/>
+          <w:bottom w:val="none" w:color="000000" w:sz="4" w:space="0"/>
+          <w:right w:val="none" w:color="000000" w:sz="4" w:space="0"/>
         </w:tcBorders>
       </w:tcPr>
     </w:tblStylePr>
@@ -14815,9 +14857,9 @@
         <w:shd w:val="clear" w:color="ffffff" w:themeColor="light1" w:fill="ffffff" w:themeFill="light1"/>
         <w:tcBorders>
           <w:top w:val="single" w:color="000000" w:themeColor="accent3" w:themeTint="FE" w:sz="4" w:space="0"/>
-          <w:left w:val="none"/>
-          <w:bottom w:val="none"/>
-          <w:right w:val="none"/>
+          <w:left w:val="none" w:color="000000" w:sz="4" w:space="0"/>
+          <w:bottom w:val="none" w:color="000000" w:sz="4" w:space="0"/>
+          <w:right w:val="none" w:color="000000" w:sz="4" w:space="0"/>
         </w:tcBorders>
       </w:tcPr>
     </w:tblStylePr>
@@ -14887,9 +14929,9 @@
       </w:tcPr>
     </w:tblStylePr>
   </w:style>
-  <w:style w:type="table" w:styleId="64">
+  <w:style w:type="table" w:styleId="779">
     <w:name w:val="Grid Table 7 Colorful - Accent 4"/>
-    <w:basedOn w:val="1129"/>
+    <w:basedOn w:val="910"/>
     <w:uiPriority w:val="99"/>
     <w:pPr>
       <w:pBdr/>
@@ -14991,11 +15033,11 @@
         <w:tblBorders/>
       </w:tblPr>
       <w:tcPr>
-        <w:shd w:color="ffffff"/>
+        <w:shd w:val="clear" w:color="ffffff"/>
         <w:tcBorders>
-          <w:top w:val="none"/>
-          <w:left w:val="none"/>
-          <w:bottom w:val="none"/>
+          <w:top w:val="none" w:color="000000" w:sz="4" w:space="0"/>
+          <w:left w:val="none" w:color="000000" w:sz="4" w:space="0"/>
+          <w:bottom w:val="none" w:color="000000" w:sz="4" w:space="0"/>
           <w:right w:val="single" w:color="000000" w:themeColor="accent4" w:themeTint="9A" w:sz="4" w:space="0"/>
         </w:tcBorders>
       </w:tcPr>
@@ -15018,10 +15060,10 @@
       <w:tcPr>
         <w:shd w:val="clear" w:color="ffffff" w:themeColor="light1" w:fill="ffffff" w:themeFill="light1"/>
         <w:tcBorders>
-          <w:top w:val="none"/>
-          <w:left w:val="none"/>
+          <w:top w:val="none" w:color="000000" w:sz="4" w:space="0"/>
+          <w:left w:val="none" w:color="000000" w:sz="4" w:space="0"/>
           <w:bottom w:val="single" w:color="000000" w:themeColor="accent4" w:themeTint="9A" w:sz="4" w:space="0"/>
-          <w:right w:val="none"/>
+          <w:right w:val="none" w:color="000000" w:sz="4" w:space="0"/>
         </w:tcBorders>
       </w:tcPr>
     </w:tblStylePr>
@@ -15041,12 +15083,12 @@
         <w:tblBorders/>
       </w:tblPr>
       <w:tcPr>
-        <w:shd w:color="ffffff"/>
+        <w:shd w:val="clear" w:color="ffffff"/>
         <w:tcBorders>
-          <w:top w:val="none"/>
+          <w:top w:val="none" w:color="000000" w:sz="4" w:space="0"/>
           <w:left w:val="single" w:color="000000" w:themeColor="accent4" w:themeTint="9A" w:sz="4" w:space="0"/>
-          <w:bottom w:val="none"/>
-          <w:right w:val="none"/>
+          <w:bottom w:val="none" w:color="000000" w:sz="4" w:space="0"/>
+          <w:right w:val="none" w:color="000000" w:sz="4" w:space="0"/>
         </w:tcBorders>
       </w:tcPr>
     </w:tblStylePr>
@@ -15069,9 +15111,9 @@
         <w:shd w:val="clear" w:color="ffffff" w:themeColor="light1" w:fill="ffffff" w:themeFill="light1"/>
         <w:tcBorders>
           <w:top w:val="single" w:color="000000" w:themeColor="accent4" w:themeTint="9A" w:sz="4" w:space="0"/>
-          <w:left w:val="none"/>
-          <w:bottom w:val="none"/>
-          <w:right w:val="none"/>
+          <w:left w:val="none" w:color="000000" w:sz="4" w:space="0"/>
+          <w:bottom w:val="none" w:color="000000" w:sz="4" w:space="0"/>
+          <w:right w:val="none" w:color="000000" w:sz="4" w:space="0"/>
         </w:tcBorders>
       </w:tcPr>
     </w:tblStylePr>
@@ -15141,9 +15183,9 @@
       </w:tcPr>
     </w:tblStylePr>
   </w:style>
-  <w:style w:type="table" w:styleId="65">
+  <w:style w:type="table" w:styleId="780">
     <w:name w:val="Grid Table 7 Colorful - Accent 5"/>
-    <w:basedOn w:val="1129"/>
+    <w:basedOn w:val="910"/>
     <w:uiPriority w:val="99"/>
     <w:pPr>
       <w:pBdr/>
@@ -15245,11 +15287,11 @@
         <w:tblBorders/>
       </w:tblPr>
       <w:tcPr>
-        <w:shd w:color="ffffff"/>
+        <w:shd w:val="clear" w:color="ffffff"/>
         <w:tcBorders>
-          <w:top w:val="none"/>
-          <w:left w:val="none"/>
-          <w:bottom w:val="none"/>
+          <w:top w:val="none" w:color="000000" w:sz="4" w:space="0"/>
+          <w:left w:val="none" w:color="000000" w:sz="4" w:space="0"/>
+          <w:bottom w:val="none" w:color="000000" w:sz="4" w:space="0"/>
           <w:right w:val="single" w:color="000000" w:themeColor="accent5" w:themeTint="90" w:sz="4" w:space="0"/>
         </w:tcBorders>
       </w:tcPr>
@@ -15272,10 +15314,10 @@
       <w:tcPr>
         <w:shd w:val="clear" w:color="ffffff" w:themeColor="light1" w:fill="ffffff" w:themeFill="light1"/>
         <w:tcBorders>
-          <w:top w:val="none"/>
-          <w:left w:val="none"/>
+          <w:top w:val="none" w:color="000000" w:sz="4" w:space="0"/>
+          <w:left w:val="none" w:color="000000" w:sz="4" w:space="0"/>
           <w:bottom w:val="single" w:color="000000" w:themeColor="accent5" w:themeTint="90" w:sz="4" w:space="0"/>
-          <w:right w:val="none"/>
+          <w:right w:val="none" w:color="000000" w:sz="4" w:space="0"/>
         </w:tcBorders>
       </w:tcPr>
     </w:tblStylePr>
@@ -15295,12 +15337,12 @@
         <w:tblBorders/>
       </w:tblPr>
       <w:tcPr>
-        <w:shd w:color="ffffff"/>
+        <w:shd w:val="clear" w:color="ffffff"/>
         <w:tcBorders>
-          <w:top w:val="none"/>
+          <w:top w:val="none" w:color="000000" w:sz="4" w:space="0"/>
           <w:left w:val="single" w:color="000000" w:themeColor="accent5" w:themeTint="90" w:sz="4" w:space="0"/>
-          <w:bottom w:val="none"/>
-          <w:right w:val="none"/>
+          <w:bottom w:val="none" w:color="000000" w:sz="4" w:space="0"/>
+          <w:right w:val="none" w:color="000000" w:sz="4" w:space="0"/>
         </w:tcBorders>
       </w:tcPr>
     </w:tblStylePr>
@@ -15323,9 +15365,9 @@
         <w:shd w:val="clear" w:color="ffffff" w:themeColor="light1" w:fill="ffffff" w:themeFill="light1"/>
         <w:tcBorders>
           <w:top w:val="single" w:color="000000" w:themeColor="accent5" w:themeTint="90" w:sz="4" w:space="0"/>
-          <w:left w:val="none"/>
-          <w:bottom w:val="none"/>
-          <w:right w:val="none"/>
+          <w:left w:val="none" w:color="000000" w:sz="4" w:space="0"/>
+          <w:bottom w:val="none" w:color="000000" w:sz="4" w:space="0"/>
+          <w:right w:val="none" w:color="000000" w:sz="4" w:space="0"/>
         </w:tcBorders>
       </w:tcPr>
     </w:tblStylePr>
@@ -15395,9 +15437,9 @@
       </w:tcPr>
     </w:tblStylePr>
   </w:style>
-  <w:style w:type="table" w:styleId="66">
+  <w:style w:type="table" w:styleId="781">
     <w:name w:val="Grid Table 7 Colorful - Accent 6"/>
-    <w:basedOn w:val="1129"/>
+    <w:basedOn w:val="910"/>
     <w:uiPriority w:val="99"/>
     <w:pPr>
       <w:pBdr/>
@@ -15499,11 +15541,11 @@
         <w:tblBorders/>
       </w:tblPr>
       <w:tcPr>
-        <w:shd w:color="ffffff"/>
+        <w:shd w:val="clear" w:color="ffffff"/>
         <w:tcBorders>
-          <w:top w:val="none"/>
-          <w:left w:val="none"/>
-          <w:bottom w:val="none"/>
+          <w:top w:val="none" w:color="000000" w:sz="4" w:space="0"/>
+          <w:left w:val="none" w:color="000000" w:sz="4" w:space="0"/>
+          <w:bottom w:val="none" w:color="000000" w:sz="4" w:space="0"/>
           <w:right w:val="single" w:color="000000" w:themeColor="accent6" w:themeTint="90" w:sz="4" w:space="0"/>
         </w:tcBorders>
       </w:tcPr>
@@ -15526,10 +15568,10 @@
       <w:tcPr>
         <w:shd w:val="clear" w:color="ffffff" w:themeColor="light1" w:fill="ffffff" w:themeFill="light1"/>
         <w:tcBorders>
-          <w:top w:val="none"/>
-          <w:left w:val="none"/>
+          <w:top w:val="none" w:color="000000" w:sz="4" w:space="0"/>
+          <w:left w:val="none" w:color="000000" w:sz="4" w:space="0"/>
           <w:bottom w:val="single" w:color="000000" w:themeColor="accent6" w:themeTint="90" w:sz="4" w:space="0"/>
-          <w:right w:val="none"/>
+          <w:right w:val="none" w:color="000000" w:sz="4" w:space="0"/>
         </w:tcBorders>
       </w:tcPr>
     </w:tblStylePr>
@@ -15549,12 +15591,12 @@
         <w:tblBorders/>
       </w:tblPr>
       <w:tcPr>
-        <w:shd w:color="ffffff"/>
+        <w:shd w:val="clear" w:color="ffffff"/>
         <w:tcBorders>
-          <w:top w:val="none"/>
+          <w:top w:val="none" w:color="000000" w:sz="4" w:space="0"/>
           <w:left w:val="single" w:color="000000" w:themeColor="accent6" w:themeTint="90" w:sz="4" w:space="0"/>
-          <w:bottom w:val="none"/>
-          <w:right w:val="none"/>
+          <w:bottom w:val="none" w:color="000000" w:sz="4" w:space="0"/>
+          <w:right w:val="none" w:color="000000" w:sz="4" w:space="0"/>
         </w:tcBorders>
       </w:tcPr>
     </w:tblStylePr>
@@ -15577,9 +15619,9 @@
         <w:shd w:val="clear" w:color="ffffff" w:themeColor="light1" w:fill="ffffff" w:themeFill="light1"/>
         <w:tcBorders>
           <w:top w:val="single" w:color="000000" w:themeColor="accent6" w:themeTint="90" w:sz="4" w:space="0"/>
-          <w:left w:val="none"/>
-          <w:bottom w:val="none"/>
-          <w:right w:val="none"/>
+          <w:left w:val="none" w:color="000000" w:sz="4" w:space="0"/>
+          <w:bottom w:val="none" w:color="000000" w:sz="4" w:space="0"/>
+          <w:right w:val="none" w:color="000000" w:sz="4" w:space="0"/>
         </w:tcBorders>
       </w:tcPr>
     </w:tblStylePr>
@@ -15649,9 +15691,9 @@
       </w:tcPr>
     </w:tblStylePr>
   </w:style>
-  <w:style w:type="table" w:styleId="67">
+  <w:style w:type="table" w:styleId="782">
     <w:name w:val="List Table 1 Light"/>
-    <w:basedOn w:val="1129"/>
+    <w:basedOn w:val="910"/>
     <w:uiPriority w:val="99"/>
     <w:pPr>
       <w:pBdr/>
@@ -15865,9 +15907,9 @@
       </w:tcPr>
     </w:tblStylePr>
   </w:style>
-  <w:style w:type="table" w:styleId="68">
+  <w:style w:type="table" w:styleId="783">
     <w:name w:val="List Table 1 Light - Accent 1"/>
-    <w:basedOn w:val="1129"/>
+    <w:basedOn w:val="910"/>
     <w:uiPriority w:val="99"/>
     <w:pPr>
       <w:pBdr/>
@@ -16081,9 +16123,9 @@
       </w:tcPr>
     </w:tblStylePr>
   </w:style>
-  <w:style w:type="table" w:styleId="69">
+  <w:style w:type="table" w:styleId="784">
     <w:name w:val="List Table 1 Light - Accent 2"/>
-    <w:basedOn w:val="1129"/>
+    <w:basedOn w:val="910"/>
     <w:uiPriority w:val="99"/>
     <w:pPr>
       <w:pBdr/>
@@ -16297,9 +16339,9 @@
       </w:tcPr>
     </w:tblStylePr>
   </w:style>
-  <w:style w:type="table" w:styleId="70">
+  <w:style w:type="table" w:styleId="785">
     <w:name w:val="List Table 1 Light - Accent 3"/>
-    <w:basedOn w:val="1129"/>
+    <w:basedOn w:val="910"/>
     <w:uiPriority w:val="99"/>
     <w:pPr>
       <w:pBdr/>
@@ -16513,9 +16555,9 @@
       </w:tcPr>
     </w:tblStylePr>
   </w:style>
-  <w:style w:type="table" w:styleId="71">
+  <w:style w:type="table" w:styleId="786">
     <w:name w:val="List Table 1 Light - Accent 4"/>
-    <w:basedOn w:val="1129"/>
+    <w:basedOn w:val="910"/>
     <w:uiPriority w:val="99"/>
     <w:pPr>
       <w:pBdr/>
@@ -16729,9 +16771,9 @@
       </w:tcPr>
     </w:tblStylePr>
   </w:style>
-  <w:style w:type="table" w:styleId="72">
+  <w:style w:type="table" w:styleId="787">
     <w:name w:val="List Table 1 Light - Accent 5"/>
-    <w:basedOn w:val="1129"/>
+    <w:basedOn w:val="910"/>
     <w:uiPriority w:val="99"/>
     <w:pPr>
       <w:pBdr/>
@@ -16945,9 +16987,9 @@
       </w:tcPr>
     </w:tblStylePr>
   </w:style>
-  <w:style w:type="table" w:styleId="73">
+  <w:style w:type="table" w:styleId="788">
     <w:name w:val="List Table 1 Light - Accent 6"/>
-    <w:basedOn w:val="1129"/>
+    <w:basedOn w:val="910"/>
     <w:uiPriority w:val="99"/>
     <w:pPr>
       <w:pBdr/>
@@ -17161,9 +17203,9 @@
       </w:tcPr>
     </w:tblStylePr>
   </w:style>
-  <w:style w:type="table" w:styleId="74">
+  <w:style w:type="table" w:styleId="789">
     <w:name w:val="List Table 2"/>
-    <w:basedOn w:val="1129"/>
+    <w:basedOn w:val="910"/>
     <w:uiPriority w:val="99"/>
     <w:pPr>
       <w:pBdr/>
@@ -17399,9 +17441,9 @@
       </w:tcPr>
     </w:tblStylePr>
   </w:style>
-  <w:style w:type="table" w:styleId="75">
+  <w:style w:type="table" w:styleId="790">
     <w:name w:val="List Table 2 - Accent 1"/>
-    <w:basedOn w:val="1129"/>
+    <w:basedOn w:val="910"/>
     <w:uiPriority w:val="99"/>
     <w:pPr>
       <w:pBdr/>
@@ -17637,9 +17679,9 @@
       </w:tcPr>
     </w:tblStylePr>
   </w:style>
-  <w:style w:type="table" w:styleId="76">
+  <w:style w:type="table" w:styleId="791">
     <w:name w:val="List Table 2 - Accent 2"/>
-    <w:basedOn w:val="1129"/>
+    <w:basedOn w:val="910"/>
     <w:uiPriority w:val="99"/>
     <w:pPr>
       <w:pBdr/>
@@ -17875,9 +17917,9 @@
       </w:tcPr>
     </w:tblStylePr>
   </w:style>
-  <w:style w:type="table" w:styleId="77">
+  <w:style w:type="table" w:styleId="792">
     <w:name w:val="List Table 2 - Accent 3"/>
-    <w:basedOn w:val="1129"/>
+    <w:basedOn w:val="910"/>
     <w:uiPriority w:val="99"/>
     <w:pPr>
       <w:pBdr/>
@@ -18113,9 +18155,9 @@
       </w:tcPr>
     </w:tblStylePr>
   </w:style>
-  <w:style w:type="table" w:styleId="78">
+  <w:style w:type="table" w:styleId="793">
     <w:name w:val="List Table 2 - Accent 4"/>
-    <w:basedOn w:val="1129"/>
+    <w:basedOn w:val="910"/>
     <w:uiPriority w:val="99"/>
     <w:pPr>
       <w:pBdr/>
@@ -18351,9 +18393,9 @@
       </w:tcPr>
     </w:tblStylePr>
   </w:style>
-  <w:style w:type="table" w:styleId="79">
+  <w:style w:type="table" w:styleId="794">
     <w:name w:val="List Table 2 - Accent 5"/>
-    <w:basedOn w:val="1129"/>
+    <w:basedOn w:val="910"/>
     <w:uiPriority w:val="99"/>
     <w:pPr>
       <w:pBdr/>
@@ -18589,9 +18631,9 @@
       </w:tcPr>
     </w:tblStylePr>
   </w:style>
-  <w:style w:type="table" w:styleId="80">
+  <w:style w:type="table" w:styleId="795">
     <w:name w:val="List Table 2 - Accent 6"/>
-    <w:basedOn w:val="1129"/>
+    <w:basedOn w:val="910"/>
     <w:uiPriority w:val="99"/>
     <w:pPr>
       <w:pBdr/>
@@ -18827,9 +18869,9 @@
       </w:tcPr>
     </w:tblStylePr>
   </w:style>
-  <w:style w:type="table" w:styleId="81">
+  <w:style w:type="table" w:styleId="796">
     <w:name w:val="List Table 3"/>
-    <w:basedOn w:val="1129"/>
+    <w:basedOn w:val="910"/>
     <w:uiPriority w:val="99"/>
     <w:pPr>
       <w:pBdr/>
@@ -19055,9 +19097,9 @@
       </w:tcPr>
     </w:tblStylePr>
   </w:style>
-  <w:style w:type="table" w:styleId="82">
+  <w:style w:type="table" w:styleId="797">
     <w:name w:val="List Table 3 - Accent 1"/>
-    <w:basedOn w:val="1129"/>
+    <w:basedOn w:val="910"/>
     <w:uiPriority w:val="99"/>
     <w:pPr>
       <w:pBdr/>
@@ -19283,9 +19325,9 @@
       </w:tcPr>
     </w:tblStylePr>
   </w:style>
-  <w:style w:type="table" w:styleId="83">
+  <w:style w:type="table" w:styleId="798">
     <w:name w:val="List Table 3 - Accent 2"/>
-    <w:basedOn w:val="1129"/>
+    <w:basedOn w:val="910"/>
     <w:uiPriority w:val="99"/>
     <w:pPr>
       <w:pBdr/>
@@ -19511,9 +19553,9 @@
       </w:tcPr>
     </w:tblStylePr>
   </w:style>
-  <w:style w:type="table" w:styleId="84">
+  <w:style w:type="table" w:styleId="799">
     <w:name w:val="List Table 3 - Accent 3"/>
-    <w:basedOn w:val="1129"/>
+    <w:basedOn w:val="910"/>
     <w:uiPriority w:val="99"/>
     <w:pPr>
       <w:pBdr/>
@@ -19739,9 +19781,9 @@
       </w:tcPr>
     </w:tblStylePr>
   </w:style>
-  <w:style w:type="table" w:styleId="85">
+  <w:style w:type="table" w:styleId="800">
     <w:name w:val="List Table 3 - Accent 4"/>
-    <w:basedOn w:val="1129"/>
+    <w:basedOn w:val="910"/>
     <w:uiPriority w:val="99"/>
     <w:pPr>
       <w:pBdr/>
@@ -19967,9 +20009,9 @@
       </w:tcPr>
     </w:tblStylePr>
   </w:style>
-  <w:style w:type="table" w:styleId="86">
+  <w:style w:type="table" w:styleId="801">
     <w:name w:val="List Table 3 - Accent 5"/>
-    <w:basedOn w:val="1129"/>
+    <w:basedOn w:val="910"/>
     <w:uiPriority w:val="99"/>
     <w:pPr>
       <w:pBdr/>
@@ -20195,9 +20237,9 @@
       </w:tcPr>
     </w:tblStylePr>
   </w:style>
-  <w:style w:type="table" w:styleId="87">
+  <w:style w:type="table" w:styleId="802">
     <w:name w:val="List Table 3 - Accent 6"/>
-    <w:basedOn w:val="1129"/>
+    <w:basedOn w:val="910"/>
     <w:uiPriority w:val="99"/>
     <w:pPr>
       <w:pBdr/>
@@ -20423,9 +20465,9 @@
       </w:tcPr>
     </w:tblStylePr>
   </w:style>
-  <w:style w:type="table" w:styleId="88">
+  <w:style w:type="table" w:styleId="803">
     <w:name w:val="List Table 4"/>
-    <w:basedOn w:val="1129"/>
+    <w:basedOn w:val="910"/>
     <w:uiPriority w:val="99"/>
     <w:pPr>
       <w:pBdr/>
@@ -20648,9 +20690,9 @@
       </w:tcPr>
     </w:tblStylePr>
   </w:style>
-  <w:style w:type="table" w:styleId="89">
+  <w:style w:type="table" w:styleId="804">
     <w:name w:val="List Table 4 - Accent 1"/>
-    <w:basedOn w:val="1129"/>
+    <w:basedOn w:val="910"/>
     <w:uiPriority w:val="99"/>
     <w:pPr>
       <w:pBdr/>
@@ -20873,9 +20915,9 @@
       </w:tcPr>
     </w:tblStylePr>
   </w:style>
-  <w:style w:type="table" w:styleId="90">
+  <w:style w:type="table" w:styleId="805">
     <w:name w:val="List Table 4 - Accent 2"/>
-    <w:basedOn w:val="1129"/>
+    <w:basedOn w:val="910"/>
     <w:uiPriority w:val="99"/>
     <w:pPr>
       <w:pBdr/>
@@ -21098,9 +21140,9 @@
       </w:tcPr>
     </w:tblStylePr>
   </w:style>
-  <w:style w:type="table" w:styleId="91">
+  <w:style w:type="table" w:styleId="806">
     <w:name w:val="List Table 4 - Accent 3"/>
-    <w:basedOn w:val="1129"/>
+    <w:basedOn w:val="910"/>
     <w:uiPriority w:val="99"/>
     <w:pPr>
       <w:pBdr/>
@@ -21323,9 +21365,9 @@
       </w:tcPr>
     </w:tblStylePr>
   </w:style>
-  <w:style w:type="table" w:styleId="92">
+  <w:style w:type="table" w:styleId="807">
     <w:name w:val="List Table 4 - Accent 4"/>
-    <w:basedOn w:val="1129"/>
+    <w:basedOn w:val="910"/>
     <w:uiPriority w:val="99"/>
     <w:pPr>
       <w:pBdr/>
@@ -21548,9 +21590,9 @@
       </w:tcPr>
     </w:tblStylePr>
   </w:style>
-  <w:style w:type="table" w:styleId="93">
+  <w:style w:type="table" w:styleId="808">
     <w:name w:val="List Table 4 - Accent 5"/>
-    <w:basedOn w:val="1129"/>
+    <w:basedOn w:val="910"/>
     <w:uiPriority w:val="99"/>
     <w:pPr>
       <w:pBdr/>
@@ -21773,9 +21815,9 @@
       </w:tcPr>
     </w:tblStylePr>
   </w:style>
-  <w:style w:type="table" w:styleId="94">
+  <w:style w:type="table" w:styleId="809">
     <w:name w:val="List Table 4 - Accent 6"/>
-    <w:basedOn w:val="1129"/>
+    <w:basedOn w:val="910"/>
     <w:uiPriority w:val="99"/>
     <w:pPr>
       <w:pBdr/>
@@ -21998,9 +22040,9 @@
       </w:tcPr>
     </w:tblStylePr>
   </w:style>
-  <w:style w:type="table" w:styleId="95">
+  <w:style w:type="table" w:styleId="810">
     <w:name w:val="List Table 5 Dark"/>
-    <w:basedOn w:val="1129"/>
+    <w:basedOn w:val="910"/>
     <w:uiPriority w:val="99"/>
     <w:pPr>
       <w:pBdr/>
@@ -22240,9 +22282,9 @@
       </w:tcPr>
     </w:tblStylePr>
   </w:style>
-  <w:style w:type="table" w:styleId="96">
+  <w:style w:type="table" w:styleId="811">
     <w:name w:val="List Table 5 Dark - Accent 1"/>
-    <w:basedOn w:val="1129"/>
+    <w:basedOn w:val="910"/>
     <w:uiPriority w:val="99"/>
     <w:pPr>
       <w:pBdr/>
@@ -22482,9 +22524,9 @@
       </w:tcPr>
     </w:tblStylePr>
   </w:style>
-  <w:style w:type="table" w:styleId="97">
+  <w:style w:type="table" w:styleId="812">
     <w:name w:val="List Table 5 Dark - Accent 2"/>
-    <w:basedOn w:val="1129"/>
+    <w:basedOn w:val="910"/>
     <w:uiPriority w:val="99"/>
     <w:pPr>
       <w:pBdr/>
@@ -22724,9 +22766,9 @@
       </w:tcPr>
     </w:tblStylePr>
   </w:style>
-  <w:style w:type="table" w:styleId="98">
+  <w:style w:type="table" w:styleId="813">
     <w:name w:val="List Table 5 Dark - Accent 3"/>
-    <w:basedOn w:val="1129"/>
+    <w:basedOn w:val="910"/>
     <w:uiPriority w:val="99"/>
     <w:pPr>
       <w:pBdr/>
@@ -22966,9 +23008,9 @@
       </w:tcPr>
     </w:tblStylePr>
   </w:style>
-  <w:style w:type="table" w:styleId="99">
+  <w:style w:type="table" w:styleId="814">
     <w:name w:val="List Table 5 Dark - Accent 4"/>
-    <w:basedOn w:val="1129"/>
+    <w:basedOn w:val="910"/>
     <w:uiPriority w:val="99"/>
     <w:pPr>
       <w:pBdr/>
@@ -23208,9 +23250,9 @@
       </w:tcPr>
     </w:tblStylePr>
   </w:style>
-  <w:style w:type="table" w:styleId="100">
+  <w:style w:type="table" w:styleId="815">
     <w:name w:val="List Table 5 Dark - Accent 5"/>
-    <w:basedOn w:val="1129"/>
+    <w:basedOn w:val="910"/>
     <w:uiPriority w:val="99"/>
     <w:pPr>
       <w:pBdr/>
@@ -23450,9 +23492,9 @@
       </w:tcPr>
     </w:tblStylePr>
   </w:style>
-  <w:style w:type="table" w:styleId="101">
+  <w:style w:type="table" w:styleId="816">
     <w:name w:val="List Table 5 Dark - Accent 6"/>
-    <w:basedOn w:val="1129"/>
+    <w:basedOn w:val="910"/>
     <w:uiPriority w:val="99"/>
     <w:pPr>
       <w:pBdr/>
@@ -23692,9 +23734,9 @@
       </w:tcPr>
     </w:tblStylePr>
   </w:style>
-  <w:style w:type="table" w:styleId="102">
+  <w:style w:type="table" w:styleId="817">
     <w:name w:val="List Table 6 Colorful"/>
-    <w:basedOn w:val="1129"/>
+    <w:basedOn w:val="910"/>
     <w:uiPriority w:val="99"/>
     <w:pPr>
       <w:pBdr/>
@@ -23915,9 +23957,9 @@
       </w:tcPr>
     </w:tblStylePr>
   </w:style>
-  <w:style w:type="table" w:styleId="103">
+  <w:style w:type="table" w:styleId="818">
     <w:name w:val="List Table 6 Colorful - Accent 1"/>
-    <w:basedOn w:val="1129"/>
+    <w:basedOn w:val="910"/>
     <w:uiPriority w:val="99"/>
     <w:pPr>
       <w:pBdr/>
@@ -24138,9 +24180,9 @@
       </w:tcPr>
     </w:tblStylePr>
   </w:style>
-  <w:style w:type="table" w:styleId="104">
+  <w:style w:type="table" w:styleId="819">
     <w:name w:val="List Table 6 Colorful - Accent 2"/>
-    <w:basedOn w:val="1129"/>
+    <w:basedOn w:val="910"/>
     <w:uiPriority w:val="99"/>
     <w:pPr>
       <w:pBdr/>
@@ -24361,9 +24403,9 @@
       </w:tcPr>
     </w:tblStylePr>
   </w:style>
-  <w:style w:type="table" w:styleId="105">
+  <w:style w:type="table" w:styleId="820">
     <w:name w:val="List Table 6 Colorful - Accent 3"/>
-    <w:basedOn w:val="1129"/>
+    <w:basedOn w:val="910"/>
     <w:uiPriority w:val="99"/>
     <w:pPr>
       <w:pBdr/>
@@ -24584,9 +24626,9 @@
       </w:tcPr>
     </w:tblStylePr>
   </w:style>
-  <w:style w:type="table" w:styleId="106">
+  <w:style w:type="table" w:styleId="821">
     <w:name w:val="List Table 6 Colorful - Accent 4"/>
-    <w:basedOn w:val="1129"/>
+    <w:basedOn w:val="910"/>
     <w:uiPriority w:val="99"/>
     <w:pPr>
       <w:pBdr/>
@@ -24807,9 +24849,9 @@
       </w:tcPr>
     </w:tblStylePr>
   </w:style>
-  <w:style w:type="table" w:styleId="107">
+  <w:style w:type="table" w:styleId="822">
     <w:name w:val="List Table 6 Colorful - Accent 5"/>
-    <w:basedOn w:val="1129"/>
+    <w:basedOn w:val="910"/>
     <w:uiPriority w:val="99"/>
     <w:pPr>
       <w:pBdr/>
@@ -25030,9 +25072,9 @@
       </w:tcPr>
     </w:tblStylePr>
   </w:style>
-  <w:style w:type="table" w:styleId="108">
+  <w:style w:type="table" w:styleId="823">
     <w:name w:val="List Table 6 Colorful - Accent 6"/>
-    <w:basedOn w:val="1129"/>
+    <w:basedOn w:val="910"/>
     <w:uiPriority w:val="99"/>
     <w:pPr>
       <w:pBdr/>
@@ -25253,9 +25295,9 @@
       </w:tcPr>
     </w:tblStylePr>
   </w:style>
-  <w:style w:type="table" w:styleId="109">
+  <w:style w:type="table" w:styleId="824">
     <w:name w:val="List Table 7 Colorful"/>
-    <w:basedOn w:val="1129"/>
+    <w:basedOn w:val="910"/>
     <w:uiPriority w:val="99"/>
     <w:pPr>
       <w:pBdr/>
@@ -25354,11 +25396,11 @@
         <w:tblBorders/>
       </w:tblPr>
       <w:tcPr>
-        <w:shd w:color="ffffff"/>
+        <w:shd w:val="clear" w:color="ffffff"/>
         <w:tcBorders>
-          <w:top w:val="none"/>
-          <w:left w:val="none"/>
-          <w:bottom w:val="none"/>
+          <w:top w:val="none" w:color="000000" w:sz="4" w:space="0"/>
+          <w:left w:val="none" w:color="000000" w:sz="4" w:space="0"/>
+          <w:bottom w:val="none" w:color="000000" w:sz="4" w:space="0"/>
           <w:right w:val="single" w:color="000000" w:themeColor="text1" w:themeTint="80" w:sz="4" w:space="0"/>
         </w:tcBorders>
       </w:tcPr>
@@ -25381,10 +25423,10 @@
       <w:tcPr>
         <w:shd w:val="clear" w:color="ffffff" w:themeColor="light1" w:fill="ffffff" w:themeFill="light1"/>
         <w:tcBorders>
-          <w:top w:val="none"/>
-          <w:left w:val="none"/>
+          <w:top w:val="none" w:color="000000" w:sz="4" w:space="0"/>
+          <w:left w:val="none" w:color="000000" w:sz="4" w:space="0"/>
           <w:bottom w:val="single" w:color="000000" w:themeColor="text1" w:themeTint="80" w:sz="4" w:space="0"/>
-          <w:right w:val="none"/>
+          <w:right w:val="none" w:color="000000" w:sz="4" w:space="0"/>
         </w:tcBorders>
       </w:tcPr>
     </w:tblStylePr>
@@ -25404,12 +25446,12 @@
         <w:tblBorders/>
       </w:tblPr>
       <w:tcPr>
-        <w:shd w:color="ffffff"/>
+        <w:shd w:val="clear" w:color="ffffff"/>
         <w:tcBorders>
-          <w:top w:val="none"/>
+          <w:top w:val="none" w:color="000000" w:sz="4" w:space="0"/>
           <w:left w:val="single" w:color="000000" w:themeColor="text1" w:themeTint="80" w:sz="4" w:space="0"/>
-          <w:bottom w:val="none"/>
-          <w:right w:val="none"/>
+          <w:bottom w:val="none" w:color="000000" w:sz="4" w:space="0"/>
+          <w:right w:val="none" w:color="000000" w:sz="4" w:space="0"/>
         </w:tcBorders>
       </w:tcPr>
     </w:tblStylePr>
@@ -25432,9 +25474,9 @@
         <w:shd w:val="clear" w:color="ffffff" w:themeColor="light1" w:fill="ffffff" w:themeFill="light1"/>
         <w:tcBorders>
           <w:top w:val="single" w:color="000000" w:themeColor="text1" w:themeTint="80" w:sz="4" w:space="0"/>
-          <w:left w:val="none"/>
-          <w:bottom w:val="none"/>
-          <w:right w:val="none"/>
+          <w:left w:val="none" w:color="000000" w:sz="4" w:space="0"/>
+          <w:bottom w:val="none" w:color="000000" w:sz="4" w:space="0"/>
+          <w:right w:val="none" w:color="000000" w:sz="4" w:space="0"/>
         </w:tcBorders>
       </w:tcPr>
     </w:tblStylePr>
@@ -25509,9 +25551,9 @@
       </w:tcPr>
     </w:tblStylePr>
   </w:style>
-  <w:style w:type="table" w:styleId="110">
+  <w:style w:type="table" w:styleId="825">
     <w:name w:val="List Table 7 Colorful - Accent 1"/>
-    <w:basedOn w:val="1129"/>
+    <w:basedOn w:val="910"/>
     <w:uiPriority w:val="99"/>
     <w:pPr>
       <w:pBdr/>
@@ -25610,11 +25652,11 @@
         <w:tblBorders/>
       </w:tblPr>
       <w:tcPr>
-        <w:shd w:color="ffffff"/>
+        <w:shd w:val="clear" w:color="ffffff"/>
         <w:tcBorders>
-          <w:top w:val="none"/>
-          <w:left w:val="none"/>
-          <w:bottom w:val="none"/>
+          <w:top w:val="none" w:color="000000" w:sz="4" w:space="0"/>
+          <w:left w:val="none" w:color="000000" w:sz="4" w:space="0"/>
+          <w:bottom w:val="none" w:color="000000" w:sz="4" w:space="0"/>
           <w:right w:val="single" w:color="000000" w:themeColor="accent1" w:sz="4" w:space="0"/>
         </w:tcBorders>
       </w:tcPr>
@@ -25637,10 +25679,10 @@
       <w:tcPr>
         <w:shd w:val="clear" w:color="ffffff" w:themeColor="light1" w:fill="ffffff" w:themeFill="light1"/>
         <w:tcBorders>
-          <w:top w:val="none"/>
-          <w:left w:val="none"/>
+          <w:top w:val="none" w:color="000000" w:sz="4" w:space="0"/>
+          <w:left w:val="none" w:color="000000" w:sz="4" w:space="0"/>
           <w:bottom w:val="single" w:color="000000" w:themeColor="accent1" w:sz="4" w:space="0"/>
-          <w:right w:val="none"/>
+          <w:right w:val="none" w:color="000000" w:sz="4" w:space="0"/>
         </w:tcBorders>
       </w:tcPr>
     </w:tblStylePr>
@@ -25660,12 +25702,12 @@
         <w:tblBorders/>
       </w:tblPr>
       <w:tcPr>
-        <w:shd w:color="ffffff"/>
+        <w:shd w:val="clear" w:color="ffffff"/>
         <w:tcBorders>
-          <w:top w:val="none"/>
+          <w:top w:val="none" w:color="000000" w:sz="4" w:space="0"/>
           <w:left w:val="single" w:color="000000" w:themeColor="accent1" w:sz="4" w:space="0"/>
-          <w:bottom w:val="none"/>
-          <w:right w:val="none"/>
+          <w:bottom w:val="none" w:color="000000" w:sz="4" w:space="0"/>
+          <w:right w:val="none" w:color="000000" w:sz="4" w:space="0"/>
         </w:tcBorders>
       </w:tcPr>
     </w:tblStylePr>
@@ -25688,9 +25730,9 @@
         <w:shd w:val="clear" w:color="ffffff" w:themeColor="light1" w:fill="ffffff" w:themeFill="light1"/>
         <w:tcBorders>
           <w:top w:val="single" w:color="000000" w:themeColor="accent1" w:sz="4" w:space="0"/>
-          <w:left w:val="none"/>
-          <w:bottom w:val="none"/>
-          <w:right w:val="none"/>
+          <w:left w:val="none" w:color="000000" w:sz="4" w:space="0"/>
+          <w:bottom w:val="none" w:color="000000" w:sz="4" w:space="0"/>
+          <w:right w:val="none" w:color="000000" w:sz="4" w:space="0"/>
         </w:tcBorders>
       </w:tcPr>
     </w:tblStylePr>
@@ -25765,9 +25807,9 @@
       </w:tcPr>
     </w:tblStylePr>
   </w:style>
-  <w:style w:type="table" w:styleId="111">
+  <w:style w:type="table" w:styleId="826">
     <w:name w:val="List Table 7 Colorful - Accent 2"/>
-    <w:basedOn w:val="1129"/>
+    <w:basedOn w:val="910"/>
     <w:uiPriority w:val="99"/>
     <w:pPr>
       <w:pBdr/>
@@ -25866,11 +25908,11 @@
         <w:tblBorders/>
       </w:tblPr>
       <w:tcPr>
-        <w:shd w:color="ffffff"/>
+        <w:shd w:val="clear" w:color="ffffff"/>
         <w:tcBorders>
-          <w:top w:val="none"/>
-          <w:left w:val="none"/>
-          <w:bottom w:val="none"/>
+          <w:top w:val="none" w:color="000000" w:sz="4" w:space="0"/>
+          <w:left w:val="none" w:color="000000" w:sz="4" w:space="0"/>
+          <w:bottom w:val="none" w:color="000000" w:sz="4" w:space="0"/>
           <w:right w:val="single" w:color="000000" w:themeColor="accent2" w:themeTint="97" w:sz="4" w:space="0"/>
         </w:tcBorders>
       </w:tcPr>
@@ -25893,10 +25935,10 @@
       <w:tcPr>
         <w:shd w:val="clear" w:color="ffffff" w:themeColor="light1" w:fill="ffffff" w:themeFill="light1"/>
         <w:tcBorders>
-          <w:top w:val="none"/>
-          <w:left w:val="none"/>
+          <w:top w:val="none" w:color="000000" w:sz="4" w:space="0"/>
+          <w:left w:val="none" w:color="000000" w:sz="4" w:space="0"/>
           <w:bottom w:val="single" w:color="000000" w:themeColor="accent2" w:themeTint="97" w:sz="4" w:space="0"/>
-          <w:right w:val="none"/>
+          <w:right w:val="none" w:color="000000" w:sz="4" w:space="0"/>
         </w:tcBorders>
       </w:tcPr>
     </w:tblStylePr>
@@ -25916,12 +25958,12 @@
         <w:tblBorders/>
       </w:tblPr>
       <w:tcPr>
-        <w:shd w:color="ffffff"/>
+        <w:shd w:val="clear" w:color="ffffff"/>
         <w:tcBorders>
-          <w:top w:val="none"/>
+          <w:top w:val="none" w:color="000000" w:sz="4" w:space="0"/>
           <w:left w:val="single" w:color="000000" w:themeColor="accent2" w:themeTint="97" w:sz="4" w:space="0"/>
-          <w:bottom w:val="none"/>
-          <w:right w:val="none"/>
+          <w:bottom w:val="none" w:color="000000" w:sz="4" w:space="0"/>
+          <w:right w:val="none" w:color="000000" w:sz="4" w:space="0"/>
         </w:tcBorders>
       </w:tcPr>
     </w:tblStylePr>
@@ -25944,9 +25986,9 @@
         <w:shd w:val="clear" w:color="ffffff" w:themeColor="light1" w:fill="ffffff" w:themeFill="light1"/>
         <w:tcBorders>
           <w:top w:val="single" w:color="000000" w:themeColor="accent2" w:themeTint="97" w:sz="4" w:space="0"/>
-          <w:left w:val="none"/>
-          <w:bottom w:val="none"/>
-          <w:right w:val="none"/>
+          <w:left w:val="none" w:color="000000" w:sz="4" w:space="0"/>
+          <w:bottom w:val="none" w:color="000000" w:sz="4" w:space="0"/>
+          <w:right w:val="none" w:color="000000" w:sz="4" w:space="0"/>
         </w:tcBorders>
       </w:tcPr>
     </w:tblStylePr>
@@ -26021,9 +26063,9 @@
       </w:tcPr>
     </w:tblStylePr>
   </w:style>
-  <w:style w:type="table" w:styleId="112">
+  <w:style w:type="table" w:styleId="827">
     <w:name w:val="List Table 7 Colorful - Accent 3"/>
-    <w:basedOn w:val="1129"/>
+    <w:basedOn w:val="910"/>
     <w:uiPriority w:val="99"/>
     <w:pPr>
       <w:pBdr/>
@@ -26122,11 +26164,11 @@
         <w:tblBorders/>
       </w:tblPr>
       <w:tcPr>
-        <w:shd w:color="ffffff"/>
+        <w:shd w:val="clear" w:color="ffffff"/>
         <w:tcBorders>
-          <w:top w:val="none"/>
-          <w:left w:val="none"/>
-          <w:bottom w:val="none"/>
+          <w:top w:val="none" w:color="000000" w:sz="4" w:space="0"/>
+          <w:left w:val="none" w:color="000000" w:sz="4" w:space="0"/>
+          <w:bottom w:val="none" w:color="000000" w:sz="4" w:space="0"/>
           <w:right w:val="single" w:color="000000" w:themeColor="accent3" w:themeTint="98" w:sz="4" w:space="0"/>
         </w:tcBorders>
       </w:tcPr>
@@ -26149,10 +26191,10 @@
       <w:tcPr>
         <w:shd w:val="clear" w:color="ffffff" w:themeColor="light1" w:fill="ffffff" w:themeFill="light1"/>
         <w:tcBorders>
-          <w:top w:val="none"/>
-          <w:left w:val="none"/>
+          <w:top w:val="none" w:color="000000" w:sz="4" w:space="0"/>
+          <w:left w:val="none" w:color="000000" w:sz="4" w:space="0"/>
           <w:bottom w:val="single" w:color="000000" w:themeColor="accent3" w:themeTint="98" w:sz="4" w:space="0"/>
-          <w:right w:val="none"/>
+          <w:right w:val="none" w:color="000000" w:sz="4" w:space="0"/>
         </w:tcBorders>
       </w:tcPr>
     </w:tblStylePr>
@@ -26172,12 +26214,12 @@
         <w:tblBorders/>
       </w:tblPr>
       <w:tcPr>
-        <w:shd w:color="ffffff"/>
+        <w:shd w:val="clear" w:color="ffffff"/>
         <w:tcBorders>
-          <w:top w:val="none"/>
+          <w:top w:val="none" w:color="000000" w:sz="4" w:space="0"/>
           <w:left w:val="single" w:color="000000" w:themeColor="accent3" w:themeTint="98" w:sz="4" w:space="0"/>
-          <w:bottom w:val="none"/>
-          <w:right w:val="none"/>
+          <w:bottom w:val="none" w:color="000000" w:sz="4" w:space="0"/>
+          <w:right w:val="none" w:color="000000" w:sz="4" w:space="0"/>
         </w:tcBorders>
       </w:tcPr>
     </w:tblStylePr>
@@ -26200,9 +26242,9 @@
         <w:shd w:val="clear" w:color="ffffff" w:themeColor="light1" w:fill="ffffff" w:themeFill="light1"/>
         <w:tcBorders>
           <w:top w:val="single" w:color="000000" w:themeColor="accent3" w:themeTint="98" w:sz="4" w:space="0"/>
-          <w:left w:val="none"/>
-          <w:bottom w:val="none"/>
-          <w:right w:val="none"/>
+          <w:left w:val="none" w:color="000000" w:sz="4" w:space="0"/>
+          <w:bottom w:val="none" w:color="000000" w:sz="4" w:space="0"/>
+          <w:right w:val="none" w:color="000000" w:sz="4" w:space="0"/>
         </w:tcBorders>
       </w:tcPr>
     </w:tblStylePr>
@@ -26277,9 +26319,9 @@
       </w:tcPr>
     </w:tblStylePr>
   </w:style>
-  <w:style w:type="table" w:styleId="113">
+  <w:style w:type="table" w:styleId="828">
     <w:name w:val="List Table 7 Colorful - Accent 4"/>
-    <w:basedOn w:val="1129"/>
+    <w:basedOn w:val="910"/>
     <w:uiPriority w:val="99"/>
     <w:pPr>
       <w:pBdr/>
@@ -26378,11 +26420,11 @@
         <w:tblBorders/>
       </w:tblPr>
       <w:tcPr>
-        <w:shd w:color="ffffff"/>
+        <w:shd w:val="clear" w:color="ffffff"/>
         <w:tcBorders>
-          <w:top w:val="none"/>
-          <w:left w:val="none"/>
-          <w:bottom w:val="none"/>
+          <w:top w:val="none" w:color="000000" w:sz="4" w:space="0"/>
+          <w:left w:val="none" w:color="000000" w:sz="4" w:space="0"/>
+          <w:bottom w:val="none" w:color="000000" w:sz="4" w:space="0"/>
           <w:right w:val="single" w:color="000000" w:themeColor="accent4" w:themeTint="9A" w:sz="4" w:space="0"/>
         </w:tcBorders>
       </w:tcPr>
@@ -26405,10 +26447,10 @@
       <w:tcPr>
         <w:shd w:val="clear" w:color="ffffff" w:themeColor="light1" w:fill="ffffff" w:themeFill="light1"/>
         <w:tcBorders>
-          <w:top w:val="none"/>
-          <w:left w:val="none"/>
+          <w:top w:val="none" w:color="000000" w:sz="4" w:space="0"/>
+          <w:left w:val="none" w:color="000000" w:sz="4" w:space="0"/>
           <w:bottom w:val="single" w:color="000000" w:themeColor="accent4" w:themeTint="9A" w:sz="4" w:space="0"/>
-          <w:right w:val="none"/>
+          <w:right w:val="none" w:color="000000" w:sz="4" w:space="0"/>
         </w:tcBorders>
       </w:tcPr>
     </w:tblStylePr>
@@ -26428,12 +26470,12 @@
         <w:tblBorders/>
       </w:tblPr>
       <w:tcPr>
-        <w:shd w:color="ffffff"/>
+        <w:shd w:val="clear" w:color="ffffff"/>
         <w:tcBorders>
-          <w:top w:val="none"/>
+          <w:top w:val="none" w:color="000000" w:sz="4" w:space="0"/>
           <w:left w:val="single" w:color="000000" w:themeColor="accent4" w:themeTint="9A" w:sz="4" w:space="0"/>
-          <w:bottom w:val="none"/>
-          <w:right w:val="none"/>
+          <w:bottom w:val="none" w:color="000000" w:sz="4" w:space="0"/>
+          <w:right w:val="none" w:color="000000" w:sz="4" w:space="0"/>
         </w:tcBorders>
       </w:tcPr>
     </w:tblStylePr>
@@ -26456,9 +26498,9 @@
         <w:shd w:val="clear" w:color="ffffff" w:themeColor="light1" w:fill="ffffff" w:themeFill="light1"/>
         <w:tcBorders>
           <w:top w:val="single" w:color="000000" w:themeColor="accent4" w:themeTint="9A" w:sz="4" w:space="0"/>
-          <w:left w:val="none"/>
-          <w:bottom w:val="none"/>
-          <w:right w:val="none"/>
+          <w:left w:val="none" w:color="000000" w:sz="4" w:space="0"/>
+          <w:bottom w:val="none" w:color="000000" w:sz="4" w:space="0"/>
+          <w:right w:val="none" w:color="000000" w:sz="4" w:space="0"/>
         </w:tcBorders>
       </w:tcPr>
     </w:tblStylePr>
@@ -26533,9 +26575,9 @@
       </w:tcPr>
     </w:tblStylePr>
   </w:style>
-  <w:style w:type="table" w:styleId="114">
+  <w:style w:type="table" w:styleId="829">
     <w:name w:val="List Table 7 Colorful - Accent 5"/>
-    <w:basedOn w:val="1129"/>
+    <w:basedOn w:val="910"/>
     <w:uiPriority w:val="99"/>
     <w:pPr>
       <w:pBdr/>
@@ -26634,11 +26676,11 @@
         <w:tblBorders/>
       </w:tblPr>
       <w:tcPr>
-        <w:shd w:color="ffffff"/>
+        <w:shd w:val="clear" w:color="ffffff"/>
         <w:tcBorders>
-          <w:top w:val="none"/>
-          <w:left w:val="none"/>
-          <w:bottom w:val="none"/>
+          <w:top w:val="none" w:color="000000" w:sz="4" w:space="0"/>
+          <w:left w:val="none" w:color="000000" w:sz="4" w:space="0"/>
+          <w:bottom w:val="none" w:color="000000" w:sz="4" w:space="0"/>
           <w:right w:val="single" w:color="000000" w:themeColor="accent5" w:themeTint="9A" w:sz="4" w:space="0"/>
         </w:tcBorders>
       </w:tcPr>
@@ -26661,10 +26703,10 @@
       <w:tcPr>
         <w:shd w:val="clear" w:color="ffffff" w:themeColor="light1" w:fill="ffffff" w:themeFill="light1"/>
         <w:tcBorders>
-          <w:top w:val="none"/>
-          <w:left w:val="none"/>
+          <w:top w:val="none" w:color="000000" w:sz="4" w:space="0"/>
+          <w:left w:val="none" w:color="000000" w:sz="4" w:space="0"/>
           <w:bottom w:val="single" w:color="000000" w:themeColor="accent5" w:themeTint="9A" w:sz="4" w:space="0"/>
-          <w:right w:val="none"/>
+          <w:right w:val="none" w:color="000000" w:sz="4" w:space="0"/>
         </w:tcBorders>
       </w:tcPr>
     </w:tblStylePr>
@@ -26684,12 +26726,12 @@
         <w:tblBorders/>
       </w:tblPr>
       <w:tcPr>
-        <w:shd w:color="ffffff"/>
+        <w:shd w:val="clear" w:color="ffffff"/>
         <w:tcBorders>
-          <w:top w:val="none"/>
+          <w:top w:val="none" w:color="000000" w:sz="4" w:space="0"/>
           <w:left w:val="single" w:color="000000" w:themeColor="accent5" w:themeTint="9A" w:sz="4" w:space="0"/>
-          <w:bottom w:val="none"/>
-          <w:right w:val="none"/>
+          <w:bottom w:val="none" w:color="000000" w:sz="4" w:space="0"/>
+          <w:right w:val="none" w:color="000000" w:sz="4" w:space="0"/>
         </w:tcBorders>
       </w:tcPr>
     </w:tblStylePr>
@@ -26712,9 +26754,9 @@
         <w:shd w:val="clear" w:color="ffffff" w:themeColor="light1" w:fill="ffffff" w:themeFill="light1"/>
         <w:tcBorders>
           <w:top w:val="single" w:color="000000" w:themeColor="accent5" w:themeTint="9A" w:sz="4" w:space="0"/>
-          <w:left w:val="none"/>
-          <w:bottom w:val="none"/>
-          <w:right w:val="none"/>
+          <w:left w:val="none" w:color="000000" w:sz="4" w:space="0"/>
+          <w:bottom w:val="none" w:color="000000" w:sz="4" w:space="0"/>
+          <w:right w:val="none" w:color="000000" w:sz="4" w:space="0"/>
         </w:tcBorders>
       </w:tcPr>
     </w:tblStylePr>
@@ -26789,9 +26831,9 @@
       </w:tcPr>
     </w:tblStylePr>
   </w:style>
-  <w:style w:type="table" w:styleId="115">
+  <w:style w:type="table" w:styleId="830">
     <w:name w:val="List Table 7 Colorful - Accent 6"/>
-    <w:basedOn w:val="1129"/>
+    <w:basedOn w:val="910"/>
     <w:uiPriority w:val="99"/>
     <w:pPr>
       <w:pBdr/>
@@ -26890,11 +26932,11 @@
         <w:tblBorders/>
       </w:tblPr>
       <w:tcPr>
-        <w:shd w:color="ffffff"/>
+        <w:shd w:val="clear" w:color="ffffff"/>
         <w:tcBorders>
-          <w:top w:val="none"/>
-          <w:left w:val="none"/>
-          <w:bottom w:val="none"/>
+          <w:top w:val="none" w:color="000000" w:sz="4" w:space="0"/>
+          <w:left w:val="none" w:color="000000" w:sz="4" w:space="0"/>
+          <w:bottom w:val="none" w:color="000000" w:sz="4" w:space="0"/>
           <w:right w:val="single" w:color="000000" w:themeColor="accent6" w:themeTint="98" w:sz="4" w:space="0"/>
         </w:tcBorders>
       </w:tcPr>
@@ -26917,10 +26959,10 @@
       <w:tcPr>
         <w:shd w:val="clear" w:color="ffffff" w:themeColor="light1" w:fill="ffffff" w:themeFill="light1"/>
         <w:tcBorders>
-          <w:top w:val="none"/>
-          <w:left w:val="none"/>
+          <w:top w:val="none" w:color="000000" w:sz="4" w:space="0"/>
+          <w:left w:val="none" w:color="000000" w:sz="4" w:space="0"/>
           <w:bottom w:val="single" w:color="000000" w:themeColor="accent6" w:themeTint="98" w:sz="4" w:space="0"/>
-          <w:right w:val="none"/>
+          <w:right w:val="none" w:color="000000" w:sz="4" w:space="0"/>
         </w:tcBorders>
       </w:tcPr>
     </w:tblStylePr>
@@ -26940,12 +26982,12 @@
         <w:tblBorders/>
       </w:tblPr>
       <w:tcPr>
-        <w:shd w:color="ffffff"/>
+        <w:shd w:val="clear" w:color="ffffff"/>
         <w:tcBorders>
-          <w:top w:val="none"/>
+          <w:top w:val="none" w:color="000000" w:sz="4" w:space="0"/>
           <w:left w:val="single" w:color="000000" w:themeColor="accent6" w:themeTint="98" w:sz="4" w:space="0"/>
-          <w:bottom w:val="none"/>
-          <w:right w:val="none"/>
+          <w:bottom w:val="none" w:color="000000" w:sz="4" w:space="0"/>
+          <w:right w:val="none" w:color="000000" w:sz="4" w:space="0"/>
         </w:tcBorders>
       </w:tcPr>
     </w:tblStylePr>
@@ -26968,9 +27010,9 @@
         <w:shd w:val="clear" w:color="ffffff" w:themeColor="light1" w:fill="ffffff" w:themeFill="light1"/>
         <w:tcBorders>
           <w:top w:val="single" w:color="000000" w:themeColor="accent6" w:themeTint="98" w:sz="4" w:space="0"/>
-          <w:left w:val="none"/>
-          <w:bottom w:val="none"/>
-          <w:right w:val="none"/>
+          <w:left w:val="none" w:color="000000" w:sz="4" w:space="0"/>
+          <w:bottom w:val="none" w:color="000000" w:sz="4" w:space="0"/>
+          <w:right w:val="none" w:color="000000" w:sz="4" w:space="0"/>
         </w:tcBorders>
       </w:tcPr>
     </w:tblStylePr>
@@ -27045,9 +27087,9 @@
       </w:tcPr>
     </w:tblStylePr>
   </w:style>
-  <w:style w:type="table" w:styleId="116">
+  <w:style w:type="table" w:styleId="831">
     <w:name w:val="Lined - Accent"/>
-    <w:basedOn w:val="1129"/>
+    <w:basedOn w:val="910"/>
     <w:uiPriority w:val="99"/>
     <w:pPr>
       <w:pBdr/>
@@ -27282,9 +27324,9 @@
       </w:tcPr>
     </w:tblStylePr>
   </w:style>
-  <w:style w:type="table" w:styleId="117">
+  <w:style w:type="table" w:styleId="832">
     <w:name w:val="Lined - Accent 1"/>
-    <w:basedOn w:val="1129"/>
+    <w:basedOn w:val="910"/>
     <w:uiPriority w:val="99"/>
     <w:pPr>
       <w:pBdr/>
@@ -27519,9 +27561,9 @@
       </w:tcPr>
     </w:tblStylePr>
   </w:style>
-  <w:style w:type="table" w:styleId="118">
+  <w:style w:type="table" w:styleId="833">
     <w:name w:val="Lined - Accent 2"/>
-    <w:basedOn w:val="1129"/>
+    <w:basedOn w:val="910"/>
     <w:uiPriority w:val="99"/>
     <w:pPr>
       <w:pBdr/>
@@ -27756,9 +27798,9 @@
       </w:tcPr>
     </w:tblStylePr>
   </w:style>
-  <w:style w:type="table" w:styleId="119">
+  <w:style w:type="table" w:styleId="834">
     <w:name w:val="Lined - Accent 3"/>
-    <w:basedOn w:val="1129"/>
+    <w:basedOn w:val="910"/>
     <w:uiPriority w:val="99"/>
     <w:pPr>
       <w:pBdr/>
@@ -27993,9 +28035,9 @@
       </w:tcPr>
     </w:tblStylePr>
   </w:style>
-  <w:style w:type="table" w:styleId="120">
+  <w:style w:type="table" w:styleId="835">
     <w:name w:val="Lined - Accent 4"/>
-    <w:basedOn w:val="1129"/>
+    <w:basedOn w:val="910"/>
     <w:uiPriority w:val="99"/>
     <w:pPr>
       <w:pBdr/>
@@ -28230,9 +28272,9 @@
       </w:tcPr>
     </w:tblStylePr>
   </w:style>
-  <w:style w:type="table" w:styleId="121">
+  <w:style w:type="table" w:styleId="836">
     <w:name w:val="Lined - Accent 5"/>
-    <w:basedOn w:val="1129"/>
+    <w:basedOn w:val="910"/>
     <w:uiPriority w:val="99"/>
     <w:pPr>
       <w:pBdr/>
@@ -28467,9 +28509,9 @@
       </w:tcPr>
     </w:tblStylePr>
   </w:style>
-  <w:style w:type="table" w:styleId="122">
+  <w:style w:type="table" w:styleId="837">
     <w:name w:val="Lined - Accent 6"/>
-    <w:basedOn w:val="1129"/>
+    <w:basedOn w:val="910"/>
     <w:uiPriority w:val="99"/>
     <w:pPr>
       <w:pBdr/>
@@ -28704,9 +28746,9 @@
       </w:tcPr>
     </w:tblStylePr>
   </w:style>
-  <w:style w:type="table" w:styleId="123">
+  <w:style w:type="table" w:styleId="838">
     <w:name w:val="Bordered &amp; Lined - Accent"/>
-    <w:basedOn w:val="1129"/>
+    <w:basedOn w:val="910"/>
     <w:uiPriority w:val="99"/>
     <w:pPr>
       <w:pBdr/>
@@ -28948,9 +28990,9 @@
       </w:tcPr>
     </w:tblStylePr>
   </w:style>
-  <w:style w:type="table" w:styleId="124">
+  <w:style w:type="table" w:styleId="839">
     <w:name w:val="Bordered &amp; Lined - Accent 1"/>
-    <w:basedOn w:val="1129"/>
+    <w:basedOn w:val="910"/>
     <w:uiPriority w:val="99"/>
     <w:pPr>
       <w:pBdr/>
@@ -29192,9 +29234,9 @@
       </w:tcPr>
     </w:tblStylePr>
   </w:style>
-  <w:style w:type="table" w:styleId="125">
+  <w:style w:type="table" w:styleId="840">
     <w:name w:val="Bordered &amp; Lined - Accent 2"/>
-    <w:basedOn w:val="1129"/>
+    <w:basedOn w:val="910"/>
     <w:uiPriority w:val="99"/>
     <w:pPr>
       <w:pBdr/>
@@ -29436,9 +29478,9 @@
       </w:tcPr>
     </w:tblStylePr>
   </w:style>
-  <w:style w:type="table" w:styleId="126">
+  <w:style w:type="table" w:styleId="841">
     <w:name w:val="Bordered &amp; Lined - Accent 3"/>
-    <w:basedOn w:val="1129"/>
+    <w:basedOn w:val="910"/>
     <w:uiPriority w:val="99"/>
     <w:pPr>
       <w:pBdr/>
@@ -29680,9 +29722,9 @@
       </w:tcPr>
     </w:tblStylePr>
   </w:style>
-  <w:style w:type="table" w:styleId="127">
+  <w:style w:type="table" w:styleId="842">
     <w:name w:val="Bordered &amp; Lined - Accent 4"/>
-    <w:basedOn w:val="1129"/>
+    <w:basedOn w:val="910"/>
     <w:uiPriority w:val="99"/>
     <w:pPr>
       <w:pBdr/>
@@ -29924,9 +29966,9 @@
       </w:tcPr>
     </w:tblStylePr>
   </w:style>
-  <w:style w:type="table" w:styleId="128">
+  <w:style w:type="table" w:styleId="843">
     <w:name w:val="Bordered &amp; Lined - Accent 5"/>
-    <w:basedOn w:val="1129"/>
+    <w:basedOn w:val="910"/>
     <w:uiPriority w:val="99"/>
     <w:pPr>
       <w:pBdr/>
@@ -30168,9 +30210,9 @@
       </w:tcPr>
     </w:tblStylePr>
   </w:style>
-  <w:style w:type="table" w:styleId="129">
+  <w:style w:type="table" w:styleId="844">
     <w:name w:val="Bordered &amp; Lined - Accent 6"/>
-    <w:basedOn w:val="1129"/>
+    <w:basedOn w:val="910"/>
     <w:uiPriority w:val="99"/>
     <w:pPr>
       <w:pBdr/>
@@ -30412,9 +30454,9 @@
       </w:tcPr>
     </w:tblStylePr>
   </w:style>
-  <w:style w:type="table" w:styleId="130">
+  <w:style w:type="table" w:styleId="845">
     <w:name w:val="Bordered"/>
-    <w:basedOn w:val="1129"/>
+    <w:basedOn w:val="910"/>
     <w:uiPriority w:val="99"/>
     <w:pPr>
       <w:pBdr/>
@@ -30643,9 +30685,9 @@
       </w:tcPr>
     </w:tblStylePr>
   </w:style>
-  <w:style w:type="table" w:styleId="131">
+  <w:style w:type="table" w:styleId="846">
     <w:name w:val="Bordered - Accent 1"/>
-    <w:basedOn w:val="1129"/>
+    <w:basedOn w:val="910"/>
     <w:uiPriority w:val="99"/>
     <w:pPr>
       <w:pBdr/>
@@ -30874,9 +30916,9 @@
       </w:tcPr>
     </w:tblStylePr>
   </w:style>
-  <w:style w:type="table" w:styleId="132">
+  <w:style w:type="table" w:styleId="847">
     <w:name w:val="Bordered - Accent 2"/>
-    <w:basedOn w:val="1129"/>
+    <w:basedOn w:val="910"/>
     <w:uiPriority w:val="99"/>
     <w:pPr>
       <w:pBdr/>
@@ -31105,9 +31147,9 @@
       </w:tcPr>
     </w:tblStylePr>
   </w:style>
-  <w:style w:type="table" w:styleId="133">
+  <w:style w:type="table" w:styleId="848">
     <w:name w:val="Bordered - Accent 3"/>
-    <w:basedOn w:val="1129"/>
+    <w:basedOn w:val="910"/>
     <w:uiPriority w:val="99"/>
     <w:pPr>
       <w:pBdr/>
@@ -31336,9 +31378,9 @@
       </w:tcPr>
     </w:tblStylePr>
   </w:style>
-  <w:style w:type="table" w:styleId="134">
+  <w:style w:type="table" w:styleId="849">
     <w:name w:val="Bordered - Accent 4"/>
-    <w:basedOn w:val="1129"/>
+    <w:basedOn w:val="910"/>
     <w:uiPriority w:val="99"/>
     <w:pPr>
       <w:pBdr/>
@@ -31567,9 +31609,9 @@
       </w:tcPr>
     </w:tblStylePr>
   </w:style>
-  <w:style w:type="table" w:styleId="135">
+  <w:style w:type="table" w:styleId="850">
     <w:name w:val="Bordered - Accent 5"/>
-    <w:basedOn w:val="1129"/>
+    <w:basedOn w:val="910"/>
     <w:uiPriority w:val="99"/>
     <w:pPr>
       <w:pBdr/>
@@ -31798,9 +31840,9 @@
       </w:tcPr>
     </w:tblStylePr>
   </w:style>
-  <w:style w:type="table" w:styleId="136">
+  <w:style w:type="table" w:styleId="851">
     <w:name w:val="Bordered - Accent 6"/>
-    <w:basedOn w:val="1129"/>
+    <w:basedOn w:val="910"/>
     <w:uiPriority w:val="99"/>
     <w:pPr>
       <w:pBdr/>
@@ -32029,11 +32071,11 @@
       </w:tcPr>
     </w:tblStylePr>
   </w:style>
-  <w:style w:type="paragraph" w:styleId="142">
+  <w:style w:type="paragraph" w:styleId="852">
     <w:name w:val="Heading 5"/>
-    <w:basedOn w:val="1123"/>
-    <w:next w:val="1123"/>
-    <w:link w:val="153"/>
+    <w:basedOn w:val="904"/>
+    <w:next w:val="904"/>
+    <w:link w:val="861"/>
     <w:uiPriority w:val="9"/>
     <w:unhideWhenUsed/>
     <w:qFormat/>
@@ -32050,11 +32092,11 @@
       <w:color w:val="0f4761" w:themeColor="accent1" w:themeShade="BF"/>
     </w:rPr>
   </w:style>
-  <w:style w:type="paragraph" w:styleId="143">
+  <w:style w:type="paragraph" w:styleId="853">
     <w:name w:val="Heading 6"/>
-    <w:basedOn w:val="1123"/>
-    <w:next w:val="1123"/>
-    <w:link w:val="154"/>
+    <w:basedOn w:val="904"/>
+    <w:next w:val="904"/>
+    <w:link w:val="862"/>
     <w:uiPriority w:val="9"/>
     <w:unhideWhenUsed/>
     <w:qFormat/>
@@ -32073,11 +32115,11 @@
       <w:color w:val="595959" w:themeColor="text1" w:themeTint="A6"/>
     </w:rPr>
   </w:style>
-  <w:style w:type="paragraph" w:styleId="144">
+  <w:style w:type="paragraph" w:styleId="854">
     <w:name w:val="Heading 7"/>
-    <w:basedOn w:val="1123"/>
-    <w:next w:val="1123"/>
-    <w:link w:val="155"/>
+    <w:basedOn w:val="904"/>
+    <w:next w:val="904"/>
+    <w:link w:val="863"/>
     <w:uiPriority w:val="9"/>
     <w:unhideWhenUsed/>
     <w:qFormat/>
@@ -32094,11 +32136,11 @@
       <w:color w:val="595959" w:themeColor="text1" w:themeTint="A6"/>
     </w:rPr>
   </w:style>
-  <w:style w:type="paragraph" w:styleId="145">
+  <w:style w:type="paragraph" w:styleId="855">
     <w:name w:val="Heading 8"/>
-    <w:basedOn w:val="1123"/>
-    <w:next w:val="1123"/>
-    <w:link w:val="156"/>
+    <w:basedOn w:val="904"/>
+    <w:next w:val="904"/>
+    <w:link w:val="864"/>
     <w:uiPriority w:val="9"/>
     <w:unhideWhenUsed/>
     <w:qFormat/>
@@ -32117,11 +32159,11 @@
       <w:color w:val="272727" w:themeColor="text1" w:themeTint="D8"/>
     </w:rPr>
   </w:style>
-  <w:style w:type="paragraph" w:styleId="146">
+  <w:style w:type="paragraph" w:styleId="856">
     <w:name w:val="Heading 9"/>
-    <w:basedOn w:val="1123"/>
-    <w:next w:val="1123"/>
-    <w:link w:val="157"/>
+    <w:basedOn w:val="904"/>
+    <w:next w:val="904"/>
+    <w:link w:val="865"/>
     <w:uiPriority w:val="9"/>
     <w:unhideWhenUsed/>
     <w:qFormat/>
@@ -32140,10 +32182,10 @@
       <w:color w:val="272727" w:themeColor="text1" w:themeTint="D8"/>
     </w:rPr>
   </w:style>
-  <w:style w:type="character" w:styleId="149">
+  <w:style w:type="character" w:styleId="857">
     <w:name w:val="Heading 1 Char"/>
-    <w:basedOn w:val="1128"/>
-    <w:link w:val="1124"/>
+    <w:basedOn w:val="909"/>
+    <w:link w:val="905"/>
     <w:uiPriority w:val="9"/>
     <w:pPr>
       <w:pBdr/>
@@ -32157,10 +32199,10 @@
       <w:szCs w:val="40"/>
     </w:rPr>
   </w:style>
-  <w:style w:type="character" w:styleId="150">
+  <w:style w:type="character" w:styleId="858">
     <w:name w:val="Heading 2 Char"/>
-    <w:basedOn w:val="1128"/>
-    <w:link w:val="1125"/>
+    <w:basedOn w:val="909"/>
+    <w:link w:val="906"/>
     <w:uiPriority w:val="9"/>
     <w:pPr>
       <w:pBdr/>
@@ -32174,10 +32216,10 @@
       <w:szCs w:val="32"/>
     </w:rPr>
   </w:style>
-  <w:style w:type="character" w:styleId="151">
+  <w:style w:type="character" w:styleId="859">
     <w:name w:val="Heading 3 Char"/>
-    <w:basedOn w:val="1128"/>
-    <w:link w:val="1126"/>
+    <w:basedOn w:val="909"/>
+    <w:link w:val="907"/>
     <w:uiPriority w:val="9"/>
     <w:pPr>
       <w:pBdr/>
@@ -32191,10 +32233,10 @@
       <w:szCs w:val="28"/>
     </w:rPr>
   </w:style>
-  <w:style w:type="character" w:styleId="152">
+  <w:style w:type="character" w:styleId="860">
     <w:name w:val="Heading 4 Char"/>
-    <w:basedOn w:val="1128"/>
-    <w:link w:val="1127"/>
+    <w:basedOn w:val="909"/>
+    <w:link w:val="908"/>
     <w:uiPriority w:val="9"/>
     <w:pPr>
       <w:pBdr/>
@@ -32208,10 +32250,10 @@
       <w:color w:val="0f4761" w:themeColor="accent1" w:themeShade="BF"/>
     </w:rPr>
   </w:style>
-  <w:style w:type="character" w:styleId="153">
+  <w:style w:type="character" w:styleId="861">
     <w:name w:val="Heading 5 Char"/>
-    <w:basedOn w:val="1128"/>
-    <w:link w:val="142"/>
+    <w:basedOn w:val="909"/>
+    <w:link w:val="852"/>
     <w:uiPriority w:val="9"/>
     <w:pPr>
       <w:pBdr/>
@@ -32223,10 +32265,10 @@
       <w:color w:val="0f4761" w:themeColor="accent1" w:themeShade="BF"/>
     </w:rPr>
   </w:style>
-  <w:style w:type="character" w:styleId="154">
+  <w:style w:type="character" w:styleId="862">
     <w:name w:val="Heading 6 Char"/>
-    <w:basedOn w:val="1128"/>
-    <w:link w:val="143"/>
+    <w:basedOn w:val="909"/>
+    <w:link w:val="853"/>
     <w:uiPriority w:val="9"/>
     <w:pPr>
       <w:pBdr/>
@@ -32240,10 +32282,10 @@
       <w:color w:val="595959" w:themeColor="text1" w:themeTint="A6"/>
     </w:rPr>
   </w:style>
-  <w:style w:type="character" w:styleId="155">
+  <w:style w:type="character" w:styleId="863">
     <w:name w:val="Heading 7 Char"/>
-    <w:basedOn w:val="1128"/>
-    <w:link w:val="144"/>
+    <w:basedOn w:val="909"/>
+    <w:link w:val="854"/>
     <w:uiPriority w:val="9"/>
     <w:pPr>
       <w:pBdr/>
@@ -32255,10 +32297,10 @@
       <w:color w:val="595959" w:themeColor="text1" w:themeTint="A6"/>
     </w:rPr>
   </w:style>
-  <w:style w:type="character" w:styleId="156">
+  <w:style w:type="character" w:styleId="864">
     <w:name w:val="Heading 8 Char"/>
-    <w:basedOn w:val="1128"/>
-    <w:link w:val="145"/>
+    <w:basedOn w:val="909"/>
+    <w:link w:val="855"/>
     <w:uiPriority w:val="9"/>
     <w:pPr>
       <w:pBdr/>
@@ -32272,10 +32314,10 @@
       <w:color w:val="272727" w:themeColor="text1" w:themeTint="D8"/>
     </w:rPr>
   </w:style>
-  <w:style w:type="character" w:styleId="157">
+  <w:style w:type="character" w:styleId="865">
     <w:name w:val="Heading 9 Char"/>
-    <w:basedOn w:val="1128"/>
-    <w:link w:val="146"/>
+    <w:basedOn w:val="909"/>
+    <w:link w:val="856"/>
     <w:uiPriority w:val="9"/>
     <w:pPr>
       <w:pBdr/>
@@ -32289,11 +32331,11 @@
       <w:color w:val="272727" w:themeColor="text1" w:themeTint="D8"/>
     </w:rPr>
   </w:style>
-  <w:style w:type="paragraph" w:styleId="158">
+  <w:style w:type="paragraph" w:styleId="866">
     <w:name w:val="Title"/>
-    <w:basedOn w:val="1123"/>
-    <w:next w:val="1123"/>
-    <w:link w:val="159"/>
+    <w:basedOn w:val="904"/>
+    <w:next w:val="904"/>
+    <w:link w:val="867"/>
     <w:uiPriority w:val="10"/>
     <w:qFormat/>
     <w:pPr>
@@ -32309,10 +32351,10 @@
       <w:szCs w:val="56"/>
     </w:rPr>
   </w:style>
-  <w:style w:type="character" w:styleId="159">
+  <w:style w:type="character" w:styleId="867">
     <w:name w:val="Title Char"/>
-    <w:basedOn w:val="1128"/>
-    <w:link w:val="158"/>
+    <w:basedOn w:val="909"/>
+    <w:link w:val="866"/>
     <w:uiPriority w:val="10"/>
     <w:pPr>
       <w:pBdr/>
@@ -32326,11 +32368,11 @@
       <w:szCs w:val="56"/>
     </w:rPr>
   </w:style>
-  <w:style w:type="paragraph" w:styleId="160">
+  <w:style w:type="paragraph" w:styleId="868">
     <w:name w:val="Subtitle"/>
-    <w:basedOn w:val="1123"/>
-    <w:next w:val="1123"/>
-    <w:link w:val="161"/>
+    <w:basedOn w:val="904"/>
+    <w:next w:val="904"/>
+    <w:link w:val="869"/>
     <w:uiPriority w:val="11"/>
     <w:qFormat/>
     <w:pPr>
@@ -32348,10 +32390,10 @@
       <w:szCs w:val="28"/>
     </w:rPr>
   </w:style>
-  <w:style w:type="character" w:styleId="161">
+  <w:style w:type="character" w:styleId="869">
     <w:name w:val="Subtitle Char"/>
-    <w:basedOn w:val="1128"/>
-    <w:link w:val="160"/>
+    <w:basedOn w:val="909"/>
+    <w:link w:val="868"/>
     <w:uiPriority w:val="11"/>
     <w:pPr>
       <w:pBdr/>
@@ -32365,11 +32407,11 @@
       <w:szCs w:val="28"/>
     </w:rPr>
   </w:style>
-  <w:style w:type="paragraph" w:styleId="162">
+  <w:style w:type="paragraph" w:styleId="870">
     <w:name w:val="Quote"/>
-    <w:basedOn w:val="1123"/>
-    <w:next w:val="1123"/>
-    <w:link w:val="163"/>
+    <w:basedOn w:val="904"/>
+    <w:next w:val="904"/>
+    <w:link w:val="871"/>
     <w:uiPriority w:val="29"/>
     <w:qFormat/>
     <w:pPr>
@@ -32384,10 +32426,10 @@
       <w:color w:val="404040" w:themeColor="text1" w:themeTint="BF"/>
     </w:rPr>
   </w:style>
-  <w:style w:type="character" w:styleId="163">
+  <w:style w:type="character" w:styleId="871">
     <w:name w:val="Quote Char"/>
-    <w:basedOn w:val="1128"/>
-    <w:link w:val="162"/>
+    <w:basedOn w:val="909"/>
+    <w:link w:val="870"/>
     <w:uiPriority w:val="29"/>
     <w:pPr>
       <w:pBdr/>
@@ -32400,9 +32442,9 @@
       <w:color w:val="404040" w:themeColor="text1" w:themeTint="BF"/>
     </w:rPr>
   </w:style>
-  <w:style w:type="character" w:styleId="165">
+  <w:style w:type="character" w:styleId="872">
     <w:name w:val="Intense Emphasis"/>
-    <w:basedOn w:val="1128"/>
+    <w:basedOn w:val="909"/>
     <w:uiPriority w:val="21"/>
     <w:qFormat/>
     <w:pPr>
@@ -32416,11 +32458,11 @@
       <w:color w:val="0f4761" w:themeColor="accent1" w:themeShade="BF"/>
     </w:rPr>
   </w:style>
-  <w:style w:type="paragraph" w:styleId="166">
+  <w:style w:type="paragraph" w:styleId="873">
     <w:name w:val="Intense Quote"/>
-    <w:basedOn w:val="1123"/>
-    <w:next w:val="1123"/>
-    <w:link w:val="167"/>
+    <w:basedOn w:val="904"/>
+    <w:next w:val="904"/>
+    <w:link w:val="874"/>
     <w:uiPriority w:val="30"/>
     <w:qFormat/>
     <w:pPr>
@@ -32438,10 +32480,10 @@
       <w:color w:val="0f4761" w:themeColor="accent1" w:themeShade="BF"/>
     </w:rPr>
   </w:style>
-  <w:style w:type="character" w:styleId="167">
+  <w:style w:type="character" w:styleId="874">
     <w:name w:val="Intense Quote Char"/>
-    <w:basedOn w:val="1128"/>
-    <w:link w:val="166"/>
+    <w:basedOn w:val="909"/>
+    <w:link w:val="873"/>
     <w:uiPriority w:val="30"/>
     <w:pPr>
       <w:pBdr/>
@@ -32454,9 +32496,9 @@
       <w:color w:val="0f4761" w:themeColor="accent1" w:themeShade="BF"/>
     </w:rPr>
   </w:style>
-  <w:style w:type="character" w:styleId="168">
+  <w:style w:type="character" w:styleId="875">
     <w:name w:val="Intense Reference"/>
-    <w:basedOn w:val="1128"/>
+    <w:basedOn w:val="909"/>
     <w:uiPriority w:val="32"/>
     <w:qFormat/>
     <w:pPr>
@@ -32472,9 +32514,9 @@
       <w:spacing w:val="5"/>
     </w:rPr>
   </w:style>
-  <w:style w:type="paragraph" w:styleId="169">
+  <w:style w:type="paragraph" w:styleId="876">
     <w:name w:val="No Spacing"/>
-    <w:basedOn w:val="1123"/>
+    <w:basedOn w:val="904"/>
     <w:uiPriority w:val="1"/>
     <w:qFormat/>
     <w:pPr>
@@ -32483,9 +32525,9 @@
       <w:ind/>
     </w:pPr>
   </w:style>
-  <w:style w:type="character" w:styleId="170">
+  <w:style w:type="character" w:styleId="877">
     <w:name w:val="Subtle Emphasis"/>
-    <w:basedOn w:val="1128"/>
+    <w:basedOn w:val="909"/>
     <w:uiPriority w:val="19"/>
     <w:qFormat/>
     <w:pPr>
@@ -32499,9 +32541,9 @@
       <w:color w:val="404040" w:themeColor="text1" w:themeTint="BF"/>
     </w:rPr>
   </w:style>
-  <w:style w:type="character" w:styleId="171">
+  <w:style w:type="character" w:styleId="878">
     <w:name w:val="Emphasis"/>
-    <w:basedOn w:val="1128"/>
+    <w:basedOn w:val="909"/>
     <w:uiPriority w:val="20"/>
     <w:qFormat/>
     <w:pPr>
@@ -32514,9 +32556,9 @@
       <w:iCs/>
     </w:rPr>
   </w:style>
-  <w:style w:type="character" w:styleId="172">
+  <w:style w:type="character" w:styleId="879">
     <w:name w:val="Strong"/>
-    <w:basedOn w:val="1128"/>
+    <w:basedOn w:val="909"/>
     <w:uiPriority w:val="22"/>
     <w:qFormat/>
     <w:pPr>
@@ -32529,9 +32571,9 @@
       <w:bCs/>
     </w:rPr>
   </w:style>
-  <w:style w:type="character" w:styleId="173">
+  <w:style w:type="character" w:styleId="880">
     <w:name w:val="Subtle Reference"/>
-    <w:basedOn w:val="1128"/>
+    <w:basedOn w:val="909"/>
     <w:uiPriority w:val="31"/>
     <w:qFormat/>
     <w:pPr>
@@ -32544,9 +32586,9 @@
       <w:color w:val="5a5a5a" w:themeColor="text1" w:themeTint="A5"/>
     </w:rPr>
   </w:style>
-  <w:style w:type="character" w:styleId="174">
+  <w:style w:type="character" w:styleId="881">
     <w:name w:val="Book Title"/>
-    <w:basedOn w:val="1128"/>
+    <w:basedOn w:val="909"/>
     <w:uiPriority w:val="33"/>
     <w:qFormat/>
     <w:pPr>
@@ -32562,10 +32604,10 @@
       <w:spacing w:val="5"/>
     </w:rPr>
   </w:style>
-  <w:style w:type="paragraph" w:styleId="175">
+  <w:style w:type="paragraph" w:styleId="882">
     <w:name w:val="Header"/>
-    <w:basedOn w:val="1123"/>
-    <w:link w:val="176"/>
+    <w:basedOn w:val="904"/>
+    <w:link w:val="883"/>
     <w:uiPriority w:val="99"/>
     <w:unhideWhenUsed/>
     <w:pPr>
@@ -32578,10 +32620,10 @@
       <w:ind/>
     </w:pPr>
   </w:style>
-  <w:style w:type="character" w:styleId="176">
+  <w:style w:type="character" w:styleId="883">
     <w:name w:val="Header Char"/>
-    <w:basedOn w:val="1128"/>
-    <w:link w:val="175"/>
+    <w:basedOn w:val="909"/>
+    <w:link w:val="882"/>
     <w:uiPriority w:val="99"/>
     <w:pPr>
       <w:pBdr/>
@@ -32589,10 +32631,10 @@
       <w:ind/>
     </w:pPr>
   </w:style>
-  <w:style w:type="paragraph" w:styleId="177">
+  <w:style w:type="paragraph" w:styleId="884">
     <w:name w:val="Footer"/>
-    <w:basedOn w:val="1123"/>
-    <w:link w:val="178"/>
+    <w:basedOn w:val="904"/>
+    <w:link w:val="885"/>
     <w:uiPriority w:val="99"/>
     <w:unhideWhenUsed/>
     <w:pPr>
@@ -32605,10 +32647,10 @@
       <w:ind/>
     </w:pPr>
   </w:style>
-  <w:style w:type="character" w:styleId="178">
+  <w:style w:type="character" w:styleId="885">
     <w:name w:val="Footer Char"/>
-    <w:basedOn w:val="1128"/>
-    <w:link w:val="177"/>
+    <w:basedOn w:val="909"/>
+    <w:link w:val="884"/>
     <w:uiPriority w:val="99"/>
     <w:pPr>
       <w:pBdr/>
@@ -32616,10 +32658,10 @@
       <w:ind/>
     </w:pPr>
   </w:style>
-  <w:style w:type="paragraph" w:styleId="179">
+  <w:style w:type="paragraph" w:styleId="886">
     <w:name w:val="Caption"/>
-    <w:basedOn w:val="1123"/>
-    <w:next w:val="1123"/>
+    <w:basedOn w:val="904"/>
+    <w:next w:val="904"/>
     <w:uiPriority w:val="35"/>
     <w:unhideWhenUsed/>
     <w:qFormat/>
@@ -32636,10 +32678,10 @@
       <w:szCs w:val="18"/>
     </w:rPr>
   </w:style>
-  <w:style w:type="paragraph" w:styleId="180">
+  <w:style w:type="paragraph" w:styleId="887">
     <w:name w:val="footnote text"/>
-    <w:basedOn w:val="1123"/>
-    <w:link w:val="181"/>
+    <w:basedOn w:val="904"/>
+    <w:link w:val="888"/>
     <w:uiPriority w:val="99"/>
     <w:semiHidden/>
     <w:unhideWhenUsed/>
@@ -32653,10 +32695,10 @@
       <w:szCs w:val="20"/>
     </w:rPr>
   </w:style>
-  <w:style w:type="character" w:styleId="181">
+  <w:style w:type="character" w:styleId="888">
     <w:name w:val="Footnote Text Char"/>
-    <w:basedOn w:val="1128"/>
-    <w:link w:val="180"/>
+    <w:basedOn w:val="909"/>
+    <w:link w:val="887"/>
     <w:uiPriority w:val="99"/>
     <w:semiHidden/>
     <w:pPr>
@@ -32669,9 +32711,9 @@
       <w:szCs w:val="20"/>
     </w:rPr>
   </w:style>
-  <w:style w:type="character" w:styleId="182">
+  <w:style w:type="character" w:styleId="889">
     <w:name w:val="footnote reference"/>
-    <w:basedOn w:val="1128"/>
+    <w:basedOn w:val="909"/>
     <w:uiPriority w:val="99"/>
     <w:semiHidden/>
     <w:unhideWhenUsed/>
@@ -32684,10 +32726,10 @@
       <w:vertAlign w:val="superscript"/>
     </w:rPr>
   </w:style>
-  <w:style w:type="paragraph" w:styleId="183">
+  <w:style w:type="paragraph" w:styleId="890">
     <w:name w:val="endnote text"/>
-    <w:basedOn w:val="1123"/>
-    <w:link w:val="184"/>
+    <w:basedOn w:val="904"/>
+    <w:link w:val="891"/>
     <w:uiPriority w:val="99"/>
     <w:semiHidden/>
     <w:unhideWhenUsed/>
@@ -32701,10 +32743,10 @@
       <w:szCs w:val="20"/>
     </w:rPr>
   </w:style>
-  <w:style w:type="character" w:styleId="184">
+  <w:style w:type="character" w:styleId="891">
     <w:name w:val="Endnote Text Char"/>
-    <w:basedOn w:val="1128"/>
-    <w:link w:val="183"/>
+    <w:basedOn w:val="909"/>
+    <w:link w:val="890"/>
     <w:uiPriority w:val="99"/>
     <w:semiHidden/>
     <w:pPr>
@@ -32717,9 +32759,9 @@
       <w:szCs w:val="20"/>
     </w:rPr>
   </w:style>
-  <w:style w:type="character" w:styleId="185">
+  <w:style w:type="character" w:styleId="892">
     <w:name w:val="endnote reference"/>
-    <w:basedOn w:val="1128"/>
+    <w:basedOn w:val="909"/>
     <w:uiPriority w:val="99"/>
     <w:semiHidden/>
     <w:unhideWhenUsed/>
@@ -32732,9 +32774,9 @@
       <w:vertAlign w:val="superscript"/>
     </w:rPr>
   </w:style>
-  <w:style w:type="character" w:styleId="186">
+  <w:style w:type="character" w:styleId="893">
     <w:name w:val="Hyperlink"/>
-    <w:basedOn w:val="1128"/>
+    <w:basedOn w:val="909"/>
     <w:uiPriority w:val="99"/>
     <w:unhideWhenUsed/>
     <w:pPr>
@@ -32747,9 +32789,9 @@
       <w:u w:val="single"/>
     </w:rPr>
   </w:style>
-  <w:style w:type="character" w:styleId="187">
+  <w:style w:type="character" w:styleId="894">
     <w:name w:val="FollowedHyperlink"/>
-    <w:basedOn w:val="1128"/>
+    <w:basedOn w:val="909"/>
     <w:uiPriority w:val="99"/>
     <w:semiHidden/>
     <w:unhideWhenUsed/>
@@ -32763,10 +32805,10 @@
       <w:u w:val="single"/>
     </w:rPr>
   </w:style>
-  <w:style w:type="paragraph" w:styleId="190">
+  <w:style w:type="paragraph" w:styleId="895">
     <w:name w:val="toc 3"/>
-    <w:basedOn w:val="1123"/>
-    <w:next w:val="1123"/>
+    <w:basedOn w:val="904"/>
+    <w:next w:val="904"/>
     <w:uiPriority w:val="39"/>
     <w:unhideWhenUsed/>
     <w:pPr>
@@ -32775,10 +32817,10 @@
       <w:ind w:left="440"/>
     </w:pPr>
   </w:style>
-  <w:style w:type="paragraph" w:styleId="191">
+  <w:style w:type="paragraph" w:styleId="896">
     <w:name w:val="toc 4"/>
-    <w:basedOn w:val="1123"/>
-    <w:next w:val="1123"/>
+    <w:basedOn w:val="904"/>
+    <w:next w:val="904"/>
     <w:uiPriority w:val="39"/>
     <w:unhideWhenUsed/>
     <w:pPr>
@@ -32787,10 +32829,10 @@
       <w:ind w:left="660"/>
     </w:pPr>
   </w:style>
-  <w:style w:type="paragraph" w:styleId="192">
+  <w:style w:type="paragraph" w:styleId="897">
     <w:name w:val="toc 5"/>
-    <w:basedOn w:val="1123"/>
-    <w:next w:val="1123"/>
+    <w:basedOn w:val="904"/>
+    <w:next w:val="904"/>
     <w:uiPriority w:val="39"/>
     <w:unhideWhenUsed/>
     <w:pPr>
@@ -32799,10 +32841,10 @@
       <w:ind w:left="880"/>
     </w:pPr>
   </w:style>
-  <w:style w:type="paragraph" w:styleId="193">
+  <w:style w:type="paragraph" w:styleId="898">
     <w:name w:val="toc 6"/>
-    <w:basedOn w:val="1123"/>
-    <w:next w:val="1123"/>
+    <w:basedOn w:val="904"/>
+    <w:next w:val="904"/>
     <w:uiPriority w:val="39"/>
     <w:unhideWhenUsed/>
     <w:pPr>
@@ -32811,10 +32853,10 @@
       <w:ind w:left="1100"/>
     </w:pPr>
   </w:style>
-  <w:style w:type="paragraph" w:styleId="194">
+  <w:style w:type="paragraph" w:styleId="899">
     <w:name w:val="toc 7"/>
-    <w:basedOn w:val="1123"/>
-    <w:next w:val="1123"/>
+    <w:basedOn w:val="904"/>
+    <w:next w:val="904"/>
     <w:uiPriority w:val="39"/>
     <w:unhideWhenUsed/>
     <w:pPr>
@@ -32823,10 +32865,10 @@
       <w:ind w:left="1320"/>
     </w:pPr>
   </w:style>
-  <w:style w:type="paragraph" w:styleId="195">
+  <w:style w:type="paragraph" w:styleId="900">
     <w:name w:val="toc 8"/>
-    <w:basedOn w:val="1123"/>
-    <w:next w:val="1123"/>
+    <w:basedOn w:val="904"/>
+    <w:next w:val="904"/>
     <w:uiPriority w:val="39"/>
     <w:unhideWhenUsed/>
     <w:pPr>
@@ -32835,10 +32877,10 @@
       <w:ind w:left="1540"/>
     </w:pPr>
   </w:style>
-  <w:style w:type="paragraph" w:styleId="196">
+  <w:style w:type="paragraph" w:styleId="901">
     <w:name w:val="toc 9"/>
-    <w:basedOn w:val="1123"/>
-    <w:next w:val="1123"/>
+    <w:basedOn w:val="904"/>
+    <w:next w:val="904"/>
     <w:uiPriority w:val="39"/>
     <w:unhideWhenUsed/>
     <w:pPr>
@@ -32847,7 +32889,7 @@
       <w:ind w:left="1760"/>
     </w:pPr>
   </w:style>
-  <w:style w:type="paragraph" w:styleId="206">
+  <w:style w:type="paragraph" w:styleId="902">
     <w:name w:val="TOC Heading"/>
     <w:uiPriority w:val="39"/>
     <w:unhideWhenUsed/>
@@ -32857,10 +32899,10 @@
       <w:ind/>
     </w:pPr>
   </w:style>
-  <w:style w:type="paragraph" w:styleId="207">
+  <w:style w:type="paragraph" w:styleId="903">
     <w:name w:val="table of figures"/>
-    <w:basedOn w:val="1123"/>
-    <w:next w:val="1123"/>
+    <w:basedOn w:val="904"/>
+    <w:next w:val="904"/>
     <w:uiPriority w:val="99"/>
     <w:unhideWhenUsed/>
     <w:pPr>
@@ -32869,7 +32911,7 @@
       <w:ind/>
     </w:pPr>
   </w:style>
-  <w:style w:type="paragraph" w:styleId="1123" w:default="1">
+  <w:style w:type="paragraph" w:styleId="904" w:default="1">
     <w:name w:val="Normal"/>
     <w:qFormat/>
     <w:pPr>
@@ -32881,9 +32923,9 @@
       <w:rFonts w:ascii="Times New Roman" w:hAnsi="Times New Roman" w:eastAsia="Times New Roman" w:cs="Times New Roman"/>
     </w:rPr>
   </w:style>
-  <w:style w:type="paragraph" w:styleId="1124">
+  <w:style w:type="paragraph" w:styleId="905">
     <w:name w:val="Heading 1"/>
-    <w:basedOn w:val="1123"/>
+    <w:basedOn w:val="904"/>
     <w:uiPriority w:val="9"/>
     <w:qFormat/>
     <w:pPr>
@@ -32899,9 +32941,9 @@
       <w:szCs w:val="41"/>
     </w:rPr>
   </w:style>
-  <w:style w:type="paragraph" w:styleId="1125">
+  <w:style w:type="paragraph" w:styleId="906">
     <w:name w:val="Heading 2"/>
-    <w:basedOn w:val="1123"/>
+    <w:basedOn w:val="904"/>
     <w:uiPriority w:val="9"/>
     <w:unhideWhenUsed/>
     <w:qFormat/>
@@ -32918,9 +32960,9 @@
       <w:szCs w:val="28"/>
     </w:rPr>
   </w:style>
-  <w:style w:type="paragraph" w:styleId="1126">
+  <w:style w:type="paragraph" w:styleId="907">
     <w:name w:val="Heading 3"/>
-    <w:basedOn w:val="1123"/>
+    <w:basedOn w:val="904"/>
     <w:uiPriority w:val="9"/>
     <w:unhideWhenUsed/>
     <w:qFormat/>
@@ -32936,9 +32978,9 @@
       <w:szCs w:val="28"/>
     </w:rPr>
   </w:style>
-  <w:style w:type="paragraph" w:styleId="1127">
+  <w:style w:type="paragraph" w:styleId="908">
     <w:name w:val="Heading 4"/>
-    <w:basedOn w:val="1123"/>
+    <w:basedOn w:val="904"/>
     <w:uiPriority w:val="9"/>
     <w:unhideWhenUsed/>
     <w:qFormat/>
@@ -32956,7 +32998,7 @@
       <w:szCs w:val="24"/>
     </w:rPr>
   </w:style>
-  <w:style w:type="character" w:styleId="1128" w:default="1">
+  <w:style w:type="character" w:styleId="909" w:default="1">
     <w:name w:val="Default Paragraph Font"/>
     <w:uiPriority w:val="1"/>
     <w:unhideWhenUsed/>
@@ -32966,7 +33008,7 @@
       <w:ind/>
     </w:pPr>
   </w:style>
-  <w:style w:type="table" w:styleId="1129" w:default="1">
+  <w:style w:type="table" w:styleId="910" w:default="1">
     <w:name w:val="Normal Table"/>
     <w:uiPriority w:val="99"/>
     <w:semiHidden/>
@@ -33159,7 +33201,7 @@
       </w:tcPr>
     </w:tblStylePr>
   </w:style>
-  <w:style w:type="numbering" w:styleId="1130" w:default="1">
+  <w:style w:type="numbering" w:styleId="911" w:default="1">
     <w:name w:val="No List"/>
     <w:uiPriority w:val="99"/>
     <w:semiHidden/>
@@ -33170,9 +33212,9 @@
       <w:ind/>
     </w:pPr>
   </w:style>
-  <w:style w:type="paragraph" w:styleId="1131">
+  <w:style w:type="paragraph" w:styleId="912">
     <w:name w:val="toc 1"/>
-    <w:basedOn w:val="1123"/>
+    <w:basedOn w:val="904"/>
     <w:uiPriority w:val="1"/>
     <w:qFormat/>
     <w:pPr>
@@ -33187,9 +33229,9 @@
       <w:szCs w:val="24"/>
     </w:rPr>
   </w:style>
-  <w:style w:type="paragraph" w:styleId="1132">
+  <w:style w:type="paragraph" w:styleId="913">
     <w:name w:val="toc 2"/>
-    <w:basedOn w:val="1123"/>
+    <w:basedOn w:val="904"/>
     <w:uiPriority w:val="1"/>
     <w:qFormat/>
     <w:pPr>
@@ -33202,9 +33244,9 @@
       <w:szCs w:val="24"/>
     </w:rPr>
   </w:style>
-  <w:style w:type="paragraph" w:styleId="1133">
+  <w:style w:type="paragraph" w:styleId="914">
     <w:name w:val="Body Text"/>
-    <w:basedOn w:val="1123"/>
+    <w:basedOn w:val="904"/>
     <w:uiPriority w:val="1"/>
     <w:qFormat/>
     <w:pPr>
@@ -33217,9 +33259,9 @@
       <w:szCs w:val="24"/>
     </w:rPr>
   </w:style>
-  <w:style w:type="paragraph" w:styleId="1134">
+  <w:style w:type="paragraph" w:styleId="915">
     <w:name w:val="List Paragraph"/>
-    <w:basedOn w:val="1123"/>
+    <w:basedOn w:val="904"/>
     <w:uiPriority w:val="1"/>
     <w:qFormat/>
     <w:pPr>
@@ -33228,9 +33270,9 @@
       <w:ind w:hanging="538" w:left="608"/>
     </w:pPr>
   </w:style>
-  <w:style w:type="paragraph" w:styleId="1135" w:customStyle="1">
+  <w:style w:type="paragraph" w:styleId="916" w:customStyle="1">
     <w:name w:val="Table Paragraph"/>
-    <w:basedOn w:val="1123"/>
+    <w:basedOn w:val="904"/>
     <w:uiPriority w:val="1"/>
     <w:qFormat/>
     <w:pPr>
@@ -33240,7 +33282,7 @@
       <w:jc w:val="center"/>
     </w:pPr>
   </w:style>
-  <w:style w:type="paragraph" w:styleId="1136" w:customStyle="1">
+  <w:style w:type="paragraph" w:styleId="917" w:customStyle="1">
     <w:name w:val="Default"/>
     <w:qFormat/>
     <w:pPr>

</xml_diff>